<commit_message>
qang 0.6.8: radius note with the angle in radians separated from the radius (§102, §103) and the IonQ caveat; README, CHANGELOG, Zenodo metadata
</commit_message>
<xml_diff>
--- a/manuscript/qang_radio_es.docx
+++ b/manuscript/qang_radio_es.docx
@@ -3571,7 +3571,103 @@
         <w:rPr>
           <w:rFonts w:ascii="Times New Roman" w:hAnsi="Times New Roman"/>
         </w:rPr>
-        <w:t xml:space="preserve">Dos</w:t>
+        <w:t xml:space="preserve">El</w:t>
+      </w:r>
+      <w:r>
+        <w:rPr>
+          <w:rFonts w:ascii="Times New Roman" w:hAnsi="Times New Roman"/>
+        </w:rPr>
+        <w:t xml:space="preserve"> </w:t>
+      </w:r>
+      <w:r>
+        <w:rPr>
+          <w:rFonts w:ascii="Times New Roman" w:hAnsi="Times New Roman"/>
+        </w:rPr>
+        <w:t xml:space="preserve">radio</w:t>
+      </w:r>
+      <w:r>
+        <w:rPr>
+          <w:rFonts w:ascii="Times New Roman" w:hAnsi="Times New Roman"/>
+        </w:rPr>
+        <w:t xml:space="preserve"> </w:t>
+      </w:r>
+      <w:r>
+        <w:rPr>
+          <w:rFonts w:ascii="Times New Roman" w:hAnsi="Times New Roman"/>
+        </w:rPr>
+        <w:t xml:space="preserve">también</w:t>
+      </w:r>
+      <w:r>
+        <w:rPr>
+          <w:rFonts w:ascii="Times New Roman" w:hAnsi="Times New Roman"/>
+        </w:rPr>
+        <w:t xml:space="preserve"> </w:t>
+      </w:r>
+      <w:r>
+        <w:rPr>
+          <w:rFonts w:ascii="Times New Roman" w:hAnsi="Times New Roman"/>
+        </w:rPr>
+        <w:t xml:space="preserve">separa</w:t>
+      </w:r>
+      <w:r>
+        <w:rPr>
+          <w:rFonts w:ascii="Times New Roman" w:hAnsi="Times New Roman"/>
+        </w:rPr>
+        <w:t xml:space="preserve"> </w:t>
+      </w:r>
+      <w:r>
+        <w:rPr>
+          <w:rFonts w:ascii="Times New Roman" w:hAnsi="Times New Roman"/>
+        </w:rPr>
+        <w:t xml:space="preserve">el</w:t>
+      </w:r>
+      <w:r>
+        <w:rPr>
+          <w:rFonts w:ascii="Times New Roman" w:hAnsi="Times New Roman"/>
+        </w:rPr>
+        <w:t xml:space="preserve"> </w:t>
+      </w:r>
+      <w:r>
+        <w:rPr>
+          <w:rFonts w:ascii="Times New Roman" w:hAnsi="Times New Roman"/>
+        </w:rPr>
+        <w:t xml:space="preserve">ángulo</w:t>
+      </w:r>
+      <w:r>
+        <w:rPr>
+          <w:rFonts w:ascii="Times New Roman" w:hAnsi="Times New Roman"/>
+        </w:rPr>
+        <w:t xml:space="preserve"> </w:t>
+      </w:r>
+      <w:r>
+        <w:rPr>
+          <w:rFonts w:ascii="Times New Roman" w:hAnsi="Times New Roman"/>
+        </w:rPr>
+        <w:t xml:space="preserve">polar</w:t>
+      </w:r>
+      <w:r>
+        <w:rPr>
+          <w:rFonts w:ascii="Times New Roman" w:hAnsi="Times New Roman"/>
+        </w:rPr>
+        <w:t xml:space="preserve"> </w:t>
+      </w:r>
+      <w:r>
+        <w:rPr>
+          <w:rFonts w:ascii="Times New Roman" w:hAnsi="Times New Roman"/>
+        </w:rPr>
+        <w:t xml:space="preserve">en</w:t>
+      </w:r>
+      <w:r>
+        <w:rPr>
+          <w:rFonts w:ascii="Times New Roman" w:hAnsi="Times New Roman"/>
+        </w:rPr>
+        <w:t xml:space="preserve"> </w:t>
+      </w:r>
+      <w:r>
+        <w:rPr>
+          <w:rFonts w:ascii="Times New Roman" w:hAnsi="Times New Roman"/>
+        </w:rPr>
+        <w:t xml:space="preserve">radianes</w:t>
       </w:r>
       <w:r>
         <w:rPr>
@@ -3595,7 +3691,610 @@
         <w:rPr>
           <w:rFonts w:ascii="Times New Roman" w:hAnsi="Times New Roman"/>
         </w:rPr>
-        <w:t xml:space="preserve">diez</w:t>
+        <w:t xml:space="preserve">la</w:t>
+      </w:r>
+      <w:r>
+        <w:rPr>
+          <w:rFonts w:ascii="Times New Roman" w:hAnsi="Times New Roman"/>
+        </w:rPr>
+        <w:t xml:space="preserve"> </w:t>
+      </w:r>
+      <w:r>
+        <w:rPr>
+          <w:rFonts w:ascii="Times New Roman" w:hAnsi="Times New Roman"/>
+        </w:rPr>
+        <w:t xml:space="preserve">longitud</w:t>
+      </w:r>
+      <w:r>
+        <w:rPr>
+          <w:rFonts w:ascii="Times New Roman" w:hAnsi="Times New Roman"/>
+        </w:rPr>
+        <w:t xml:space="preserve"> </w:t>
+      </w:r>
+      <w:r>
+        <w:rPr>
+          <w:rFonts w:ascii="Times New Roman" w:hAnsi="Times New Roman"/>
+        </w:rPr>
+        <w:t xml:space="preserve">del</w:t>
+      </w:r>
+      <w:r>
+        <w:rPr>
+          <w:rFonts w:ascii="Times New Roman" w:hAnsi="Times New Roman"/>
+        </w:rPr>
+        <w:t xml:space="preserve"> </w:t>
+      </w:r>
+      <w:r>
+        <w:rPr>
+          <w:rFonts w:ascii="Times New Roman" w:hAnsi="Times New Roman"/>
+        </w:rPr>
+        <w:t xml:space="preserve">vector,</w:t>
+      </w:r>
+      <w:r>
+        <w:rPr>
+          <w:rFonts w:ascii="Times New Roman" w:hAnsi="Times New Roman"/>
+        </w:rPr>
+        <w:t xml:space="preserve"> </w:t>
+      </w:r>
+      <m:oMath>
+        <m:r>
+          <m:t>θ</m:t>
+        </m:r>
+        <m:r>
+          <m:rPr>
+            <m:sty m:val="p"/>
+          </m:rPr>
+          <m:t>=</m:t>
+        </m:r>
+        <m:r>
+          <m:rPr>
+            <m:sty m:val="p"/>
+          </m:rPr>
+          <m:t>arccos</m:t>
+        </m:r>
+        <m:d>
+          <m:dPr>
+            <m:begChr m:val="("/>
+            <m:endChr m:val=")"/>
+            <m:sepChr m:val=""/>
+            <m:grow/>
+          </m:dPr>
+          <m:e>
+            <m:r>
+              <m:t>q</m:t>
+            </m:r>
+            <m:sSub>
+              <m:e>
+                <m:r>
+                  <m:t>g</m:t>
+                </m:r>
+              </m:e>
+              <m:sub>
+                <m:r>
+                  <m:t>Z</m:t>
+                </m:r>
+              </m:sub>
+            </m:sSub>
+            <m:r>
+              <m:rPr>
+                <m:sty m:val="p"/>
+              </m:rPr>
+              <m:t>/</m:t>
+            </m:r>
+            <m:r>
+              <m:t>r</m:t>
+            </m:r>
+          </m:e>
+        </m:d>
+      </m:oMath>
+      <w:r>
+        <w:rPr>
+          <w:rFonts w:ascii="Times New Roman" w:hAnsi="Times New Roman"/>
+        </w:rPr>
+        <w:t xml:space="preserve">:</w:t>
+      </w:r>
+      <w:r>
+        <w:rPr>
+          <w:rFonts w:ascii="Times New Roman" w:hAnsi="Times New Roman"/>
+        </w:rPr>
+        <w:t xml:space="preserve"> </w:t>
+      </w:r>
+      <w:r>
+        <w:rPr>
+          <w:rFonts w:ascii="Times New Roman" w:hAnsi="Times New Roman"/>
+        </w:rPr>
+        <w:t xml:space="preserve">este</w:t>
+      </w:r>
+      <w:r>
+        <w:rPr>
+          <w:rFonts w:ascii="Times New Roman" w:hAnsi="Times New Roman"/>
+        </w:rPr>
+        <w:t xml:space="preserve"> </w:t>
+      </w:r>
+      <w:r>
+        <w:rPr>
+          <w:rFonts w:ascii="Times New Roman" w:hAnsi="Times New Roman"/>
+        </w:rPr>
+        <w:t xml:space="preserve">ángulo</w:t>
+      </w:r>
+      <w:r>
+        <w:rPr>
+          <w:rFonts w:ascii="Times New Roman" w:hAnsi="Times New Roman"/>
+        </w:rPr>
+        <w:t xml:space="preserve"> </w:t>
+      </w:r>
+      <w:r>
+        <w:rPr>
+          <w:rFonts w:ascii="Times New Roman" w:hAnsi="Times New Roman"/>
+        </w:rPr>
+        <w:t xml:space="preserve">es</w:t>
+      </w:r>
+      <w:r>
+        <w:rPr>
+          <w:rFonts w:ascii="Times New Roman" w:hAnsi="Times New Roman"/>
+        </w:rPr>
+        <w:t xml:space="preserve"> </w:t>
+      </w:r>
+      <w:r>
+        <w:rPr>
+          <w:rFonts w:ascii="Times New Roman" w:hAnsi="Times New Roman"/>
+        </w:rPr>
+        <w:t xml:space="preserve">exacto</w:t>
+      </w:r>
+      <w:r>
+        <w:rPr>
+          <w:rFonts w:ascii="Times New Roman" w:hAnsi="Times New Roman"/>
+        </w:rPr>
+        <w:t xml:space="preserve"> </w:t>
+      </w:r>
+      <w:r>
+        <w:rPr>
+          <w:rFonts w:ascii="Times New Roman" w:hAnsi="Times New Roman"/>
+        </w:rPr>
+        <w:t xml:space="preserve">con</w:t>
+      </w:r>
+      <w:r>
+        <w:rPr>
+          <w:rFonts w:ascii="Times New Roman" w:hAnsi="Times New Roman"/>
+        </w:rPr>
+        <w:t xml:space="preserve"> </w:t>
+      </w:r>
+      <w:r>
+        <w:rPr>
+          <w:rFonts w:ascii="Times New Roman" w:hAnsi="Times New Roman"/>
+        </w:rPr>
+        <w:t xml:space="preserve">ruido</w:t>
+      </w:r>
+      <w:r>
+        <w:rPr>
+          <w:rFonts w:ascii="Times New Roman" w:hAnsi="Times New Roman"/>
+        </w:rPr>
+        <w:t xml:space="preserve"> </w:t>
+      </w:r>
+      <w:r>
+        <w:rPr>
+          <w:rFonts w:ascii="Times New Roman" w:hAnsi="Times New Roman"/>
+        </w:rPr>
+        <w:t xml:space="preserve">despolarizante,</w:t>
+      </w:r>
+      <w:r>
+        <w:rPr>
+          <w:rFonts w:ascii="Times New Roman" w:hAnsi="Times New Roman"/>
+        </w:rPr>
+        <w:t xml:space="preserve"> </w:t>
+      </w:r>
+      <w:r>
+        <w:rPr>
+          <w:rFonts w:ascii="Times New Roman" w:hAnsi="Times New Roman"/>
+        </w:rPr>
+        <w:t xml:space="preserve">donde</w:t>
+      </w:r>
+      <w:r>
+        <w:rPr>
+          <w:rFonts w:ascii="Times New Roman" w:hAnsi="Times New Roman"/>
+        </w:rPr>
+        <w:t xml:space="preserve"> </w:t>
+      </w:r>
+      <w:r>
+        <w:rPr>
+          <w:rFonts w:ascii="Times New Roman" w:hAnsi="Times New Roman"/>
+        </w:rPr>
+        <w:t xml:space="preserve">$\arccosqg_Z$</w:t>
+      </w:r>
+      <w:r>
+        <w:rPr>
+          <w:rFonts w:ascii="Times New Roman" w:hAnsi="Times New Roman"/>
+        </w:rPr>
+        <w:t xml:space="preserve"> </w:t>
+      </w:r>
+      <w:r>
+        <w:rPr>
+          <w:rFonts w:ascii="Times New Roman" w:hAnsi="Times New Roman"/>
+        </w:rPr>
+        <w:t xml:space="preserve">se</w:t>
+      </w:r>
+      <w:r>
+        <w:rPr>
+          <w:rFonts w:ascii="Times New Roman" w:hAnsi="Times New Roman"/>
+        </w:rPr>
+        <w:t xml:space="preserve"> </w:t>
+      </w:r>
+      <w:r>
+        <w:rPr>
+          <w:rFonts w:ascii="Times New Roman" w:hAnsi="Times New Roman"/>
+        </w:rPr>
+        <w:t xml:space="preserve">equivoca</w:t>
+      </w:r>
+      <w:r>
+        <w:rPr>
+          <w:rFonts w:ascii="Times New Roman" w:hAnsi="Times New Roman"/>
+        </w:rPr>
+        <w:t xml:space="preserve"> </w:t>
+      </w:r>
+      <w:r>
+        <w:rPr>
+          <w:rFonts w:ascii="Times New Roman" w:hAnsi="Times New Roman"/>
+        </w:rPr>
+        <w:t xml:space="preserve">hasta</w:t>
+      </w:r>
+      <w:r>
+        <w:rPr>
+          <w:rFonts w:ascii="Times New Roman" w:hAnsi="Times New Roman"/>
+        </w:rPr>
+        <w:t xml:space="preserve"> </w:t>
+      </w:r>
+      <w:r>
+        <w:rPr>
+          <w:rFonts w:ascii="Times New Roman" w:hAnsi="Times New Roman"/>
+        </w:rPr>
+        <w:t xml:space="preserve">0.7</w:t>
+      </w:r>
+      <w:r>
+        <w:rPr>
+          <w:rFonts w:ascii="Times New Roman" w:hAnsi="Times New Roman"/>
+        </w:rPr>
+        <w:t xml:space="preserve"> </w:t>
+      </w:r>
+      <w:r>
+        <w:rPr>
+          <w:rFonts w:ascii="Times New Roman" w:hAnsi="Times New Roman"/>
+        </w:rPr>
+        <w:t xml:space="preserve">rad,</w:t>
+      </w:r>
+      <w:r>
+        <w:rPr>
+          <w:rFonts w:ascii="Times New Roman" w:hAnsi="Times New Roman"/>
+        </w:rPr>
+        <w:t xml:space="preserve"> </w:t>
+      </w:r>
+      <w:r>
+        <w:rPr>
+          <w:rFonts w:ascii="Times New Roman" w:hAnsi="Times New Roman"/>
+        </w:rPr>
+        <w:t xml:space="preserve">y</w:t>
+      </w:r>
+      <w:r>
+        <w:rPr>
+          <w:rFonts w:ascii="Times New Roman" w:hAnsi="Times New Roman"/>
+        </w:rPr>
+        <w:t xml:space="preserve"> </w:t>
+      </w:r>
+      <w:r>
+        <w:rPr>
+          <w:rFonts w:ascii="Times New Roman" w:hAnsi="Times New Roman"/>
+        </w:rPr>
+        <w:t xml:space="preserve">es</w:t>
+      </w:r>
+      <w:r>
+        <w:rPr>
+          <w:rFonts w:ascii="Times New Roman" w:hAnsi="Times New Roman"/>
+        </w:rPr>
+        <w:t xml:space="preserve"> </w:t>
+      </w:r>
+      <w:r>
+        <w:rPr>
+          <w:rFonts w:ascii="Times New Roman" w:hAnsi="Times New Roman"/>
+        </w:rPr>
+        <w:t xml:space="preserve">entre</w:t>
+      </w:r>
+      <w:r>
+        <w:rPr>
+          <w:rFonts w:ascii="Times New Roman" w:hAnsi="Times New Roman"/>
+        </w:rPr>
+        <w:t xml:space="preserve"> </w:t>
+      </w:r>
+      <w:r>
+        <w:rPr>
+          <w:rFonts w:ascii="Times New Roman" w:hAnsi="Times New Roman"/>
+        </w:rPr>
+        <w:t xml:space="preserve">5</w:t>
+      </w:r>
+      <w:r>
+        <w:rPr>
+          <w:rFonts w:ascii="Times New Roman" w:hAnsi="Times New Roman"/>
+        </w:rPr>
+        <w:t xml:space="preserve"> </w:t>
+      </w:r>
+      <w:r>
+        <w:rPr>
+          <w:rFonts w:ascii="Times New Roman" w:hAnsi="Times New Roman"/>
+        </w:rPr>
+        <w:t xml:space="preserve">y</w:t>
+      </w:r>
+      <w:r>
+        <w:rPr>
+          <w:rFonts w:ascii="Times New Roman" w:hAnsi="Times New Roman"/>
+        </w:rPr>
+        <w:t xml:space="preserve"> </w:t>
+      </w:r>
+      <w:r>
+        <w:rPr>
+          <w:rFonts w:ascii="Times New Roman" w:hAnsi="Times New Roman"/>
+        </w:rPr>
+        <w:t xml:space="preserve">9</w:t>
+      </w:r>
+      <w:r>
+        <w:rPr>
+          <w:rFonts w:ascii="Times New Roman" w:hAnsi="Times New Roman"/>
+        </w:rPr>
+        <w:t xml:space="preserve"> </w:t>
+      </w:r>
+      <w:r>
+        <w:rPr>
+          <w:rFonts w:ascii="Times New Roman" w:hAnsi="Times New Roman"/>
+        </w:rPr>
+        <w:t xml:space="preserve">veces</w:t>
+      </w:r>
+      <w:r>
+        <w:rPr>
+          <w:rFonts w:ascii="Times New Roman" w:hAnsi="Times New Roman"/>
+        </w:rPr>
+        <w:t xml:space="preserve"> </w:t>
+      </w:r>
+      <w:r>
+        <w:rPr>
+          <w:rFonts w:ascii="Times New Roman" w:hAnsi="Times New Roman"/>
+        </w:rPr>
+        <w:t xml:space="preserve">más</w:t>
+      </w:r>
+      <w:r>
+        <w:rPr>
+          <w:rFonts w:ascii="Times New Roman" w:hAnsi="Times New Roman"/>
+        </w:rPr>
+        <w:t xml:space="preserve"> </w:t>
+      </w:r>
+      <w:r>
+        <w:rPr>
+          <w:rFonts w:ascii="Times New Roman" w:hAnsi="Times New Roman"/>
+        </w:rPr>
+        <w:t xml:space="preserve">preciso</w:t>
+      </w:r>
+      <w:r>
+        <w:rPr>
+          <w:rFonts w:ascii="Times New Roman" w:hAnsi="Times New Roman"/>
+        </w:rPr>
+        <w:t xml:space="preserve"> </w:t>
+      </w:r>
+      <w:r>
+        <w:rPr>
+          <w:rFonts w:ascii="Times New Roman" w:hAnsi="Times New Roman"/>
+        </w:rPr>
+        <w:t xml:space="preserve">en</w:t>
+      </w:r>
+      <w:r>
+        <w:rPr>
+          <w:rFonts w:ascii="Times New Roman" w:hAnsi="Times New Roman"/>
+        </w:rPr>
+        <w:t xml:space="preserve"> </w:t>
+      </w:r>
+      <w:r>
+        <w:rPr>
+          <w:rFonts w:ascii="Times New Roman" w:hAnsi="Times New Roman"/>
+        </w:rPr>
+        <w:t xml:space="preserve">los</w:t>
+      </w:r>
+      <w:r>
+        <w:rPr>
+          <w:rFonts w:ascii="Times New Roman" w:hAnsi="Times New Roman"/>
+        </w:rPr>
+        <w:t xml:space="preserve"> </w:t>
+      </w:r>
+      <w:r>
+        <w:rPr>
+          <w:rFonts w:ascii="Times New Roman" w:hAnsi="Times New Roman"/>
+        </w:rPr>
+        <w:t xml:space="preserve">modelos</w:t>
+      </w:r>
+      <w:r>
+        <w:rPr>
+          <w:rFonts w:ascii="Times New Roman" w:hAnsi="Times New Roman"/>
+        </w:rPr>
+        <w:t xml:space="preserve"> </w:t>
+      </w:r>
+      <w:r>
+        <w:rPr>
+          <w:rFonts w:ascii="Times New Roman" w:hAnsi="Times New Roman"/>
+        </w:rPr>
+        <w:t xml:space="preserve">de</w:t>
+      </w:r>
+      <w:r>
+        <w:rPr>
+          <w:rFonts w:ascii="Times New Roman" w:hAnsi="Times New Roman"/>
+        </w:rPr>
+        <w:t xml:space="preserve"> </w:t>
+      </w:r>
+      <w:r>
+        <w:rPr>
+          <w:rFonts w:ascii="Times New Roman" w:hAnsi="Times New Roman"/>
+        </w:rPr>
+        <w:t xml:space="preserve">ruido</w:t>
+      </w:r>
+      <w:r>
+        <w:rPr>
+          <w:rFonts w:ascii="Times New Roman" w:hAnsi="Times New Roman"/>
+        </w:rPr>
+        <w:t xml:space="preserve"> </w:t>
+      </w:r>
+      <w:r>
+        <w:rPr>
+          <w:rFonts w:ascii="Times New Roman" w:hAnsi="Times New Roman"/>
+        </w:rPr>
+        <w:t xml:space="preserve">de</w:t>
+      </w:r>
+      <w:r>
+        <w:rPr>
+          <w:rFonts w:ascii="Times New Roman" w:hAnsi="Times New Roman"/>
+        </w:rPr>
+        <w:t xml:space="preserve"> </w:t>
+      </w:r>
+      <w:r>
+        <w:rPr>
+          <w:rFonts w:ascii="Times New Roman" w:hAnsi="Times New Roman"/>
+        </w:rPr>
+        <w:t xml:space="preserve">equipos</w:t>
+      </w:r>
+      <w:r>
+        <w:rPr>
+          <w:rFonts w:ascii="Times New Roman" w:hAnsi="Times New Roman"/>
+        </w:rPr>
+        <w:t xml:space="preserve"> </w:t>
+      </w:r>
+      <w:r>
+        <w:rPr>
+          <w:rFonts w:ascii="Times New Roman" w:hAnsi="Times New Roman"/>
+        </w:rPr>
+        <w:t xml:space="preserve">cuando</w:t>
+      </w:r>
+      <w:r>
+        <w:rPr>
+          <w:rFonts w:ascii="Times New Roman" w:hAnsi="Times New Roman"/>
+        </w:rPr>
+        <w:t xml:space="preserve"> </w:t>
+      </w:r>
+      <w:r>
+        <w:rPr>
+          <w:rFonts w:ascii="Times New Roman" w:hAnsi="Times New Roman"/>
+        </w:rPr>
+        <w:t xml:space="preserve">las</w:t>
+      </w:r>
+      <w:r>
+        <w:rPr>
+          <w:rFonts w:ascii="Times New Roman" w:hAnsi="Times New Roman"/>
+        </w:rPr>
+        <w:t xml:space="preserve"> </w:t>
+      </w:r>
+      <w:r>
+        <w:rPr>
+          <w:rFonts w:ascii="Times New Roman" w:hAnsi="Times New Roman"/>
+        </w:rPr>
+        <w:t xml:space="preserve">compuertas</w:t>
+      </w:r>
+      <w:r>
+        <w:rPr>
+          <w:rFonts w:ascii="Times New Roman" w:hAnsi="Times New Roman"/>
+        </w:rPr>
+        <w:t xml:space="preserve"> </w:t>
+      </w:r>
+      <w:r>
+        <w:rPr>
+          <w:rFonts w:ascii="Times New Roman" w:hAnsi="Times New Roman"/>
+        </w:rPr>
+        <w:t xml:space="preserve">de</w:t>
+      </w:r>
+      <w:r>
+        <w:rPr>
+          <w:rFonts w:ascii="Times New Roman" w:hAnsi="Times New Roman"/>
+        </w:rPr>
+        <w:t xml:space="preserve"> </w:t>
+      </w:r>
+      <w:r>
+        <w:rPr>
+          <w:rFonts w:ascii="Times New Roman" w:hAnsi="Times New Roman"/>
+        </w:rPr>
+        <w:t xml:space="preserve">ruido</w:t>
+      </w:r>
+      <w:r>
+        <w:rPr>
+          <w:rFonts w:ascii="Times New Roman" w:hAnsi="Times New Roman"/>
+        </w:rPr>
+        <w:t xml:space="preserve"> </w:t>
+      </w:r>
+      <w:r>
+        <w:rPr>
+          <w:rFonts w:ascii="Times New Roman" w:hAnsi="Times New Roman"/>
+        </w:rPr>
+        <w:t xml:space="preserve">se</w:t>
+      </w:r>
+      <w:r>
+        <w:rPr>
+          <w:rFonts w:ascii="Times New Roman" w:hAnsi="Times New Roman"/>
+        </w:rPr>
+        <w:t xml:space="preserve"> </w:t>
+      </w:r>
+      <w:r>
+        <w:rPr>
+          <w:rFonts w:ascii="Times New Roman" w:hAnsi="Times New Roman"/>
+        </w:rPr>
+        <w:t xml:space="preserve">ejecutan</w:t>
+      </w:r>
+      <w:r>
+        <w:rPr>
+          <w:rFonts w:ascii="Times New Roman" w:hAnsi="Times New Roman"/>
+        </w:rPr>
+        <w:t xml:space="preserve"> </w:t>
+      </w:r>
+      <w:r>
+        <w:rPr>
+          <w:rFonts w:ascii="Times New Roman" w:hAnsi="Times New Roman"/>
+        </w:rPr>
+        <w:t xml:space="preserve">de</w:t>
+      </w:r>
+      <w:r>
+        <w:rPr>
+          <w:rFonts w:ascii="Times New Roman" w:hAnsi="Times New Roman"/>
+        </w:rPr>
+        <w:t xml:space="preserve"> </w:t>
+      </w:r>
+      <w:r>
+        <w:rPr>
+          <w:rFonts w:ascii="Times New Roman" w:hAnsi="Times New Roman"/>
+        </w:rPr>
+        <w:t xml:space="preserve">verdad.</w:t>
+      </w:r>
+      <w:r>
+        <w:rPr>
+          <w:rFonts w:ascii="Times New Roman" w:hAnsi="Times New Roman"/>
+        </w:rPr>
+        <w:t xml:space="preserve"> </w:t>
+      </w:r>
+      <w:r>
+        <w:rPr>
+          <w:rFonts w:ascii="Times New Roman" w:hAnsi="Times New Roman"/>
+        </w:rPr>
+        <w:t xml:space="preserve">Tres</w:t>
+      </w:r>
+      <w:r>
+        <w:rPr>
+          <w:rFonts w:ascii="Times New Roman" w:hAnsi="Times New Roman"/>
+        </w:rPr>
+        <w:t xml:space="preserve"> </w:t>
+      </w:r>
+      <w:r>
+        <w:rPr>
+          <w:rFonts w:ascii="Times New Roman" w:hAnsi="Times New Roman"/>
+        </w:rPr>
+        <w:t xml:space="preserve">de</w:t>
+      </w:r>
+      <w:r>
+        <w:rPr>
+          <w:rFonts w:ascii="Times New Roman" w:hAnsi="Times New Roman"/>
+        </w:rPr>
+        <w:t xml:space="preserve"> </w:t>
+      </w:r>
+      <w:r>
+        <w:rPr>
+          <w:rFonts w:ascii="Times New Roman" w:hAnsi="Times New Roman"/>
+        </w:rPr>
+        <w:t xml:space="preserve">diecinueve</w:t>
       </w:r>
       <w:r>
         <w:rPr>
@@ -3776,7 +4475,7 @@
         <w:rPr>
           <w:rFonts w:ascii="Times New Roman" w:hAnsi="Times New Roman"/>
         </w:rPr>
-        <w:t xml:space="preserve">0.6.6,</w:t>
+        <w:t xml:space="preserve">0.6.8,</w:t>
       </w:r>
       <w:r>
         <w:rPr>
@@ -7022,7 +7721,45 @@
         <w:rPr>
           <w:rFonts w:ascii="Times New Roman" w:hAnsi="Times New Roman"/>
         </w:rPr>
-        <w:t xml:space="preserve">cualquier corrida con ruido (RESEARCH_NOTES §100).</w:t>
+        <w:t xml:space="preserve">cualquier corrida con ruido (RESEARCH_NOTES §100). Los circuitos de IonQ se enviaron con el conjunto de compuertas</w:t>
+      </w:r>
+      <w:r>
+        <w:rPr>
+          <w:rFonts w:ascii="Times New Roman" w:hAnsi="Times New Roman"/>
+        </w:rPr>
+        <w:t xml:space="preserve"> </w:t>
+      </w:r>
+      <w:r>
+        <w:rPr>
+          <w:rFonts w:ascii="Times New Roman" w:hAnsi="Times New Roman"/>
+        </w:rPr>
+        <w:t xml:space="preserve">estándar de IonQ; como se vio en la Sec. </w:t>
+      </w:r>
+      <w:hyperlink w:anchor="sec:angle">
+        <w:r>
+          <w:rPr>
+            <w:rStyle w:val="Hyperlink"/>
+          </w:rPr>
+          <w:t xml:space="preserve">6</w:t>
+        </w:r>
+      </w:hyperlink>
+      <w:r>
+        <w:rPr>
+          <w:rFonts w:ascii="Times New Roman" w:hAnsi="Times New Roman"/>
+        </w:rPr>
+        <w:t xml:space="preserve">, su compilador puede simplificar circuitos que contienen identidades, así</w:t>
+      </w:r>
+      <w:r>
+        <w:rPr>
+          <w:rFonts w:ascii="Times New Roman" w:hAnsi="Times New Roman"/>
+        </w:rPr>
+        <w:t xml:space="preserve"> </w:t>
+      </w:r>
+      <w:r>
+        <w:rPr>
+          <w:rFonts w:ascii="Times New Roman" w:hAnsi="Times New Roman"/>
+        </w:rPr>
+        <w:t xml:space="preserve">que las filas de eco de IonQ pueden subestimar el ruido (igual muestran un déficit falso de 0.62–0.71).</w:t>
       </w:r>
     </w:p>
     <w:bookmarkStart w:id="30" w:name="tab:dev"/>
@@ -7686,7 +8423,7 @@
       </w:r>
     </w:p>
     <w:bookmarkEnd w:id="31"/>
-    <w:bookmarkStart w:id="34" w:name="discusión"/>
+    <w:bookmarkStart w:id="33" w:name="sec:angle"/>
     <w:p>
       <w:pPr>
         <w:pStyle w:val="Heading1"/>
@@ -7695,7 +8432,7 @@
         <w:rPr>
           <w:rFonts w:ascii="Times New Roman" w:hAnsi="Times New Roman"/>
         </w:rPr>
-        <w:t xml:space="preserve">Discusión</w:t>
+        <w:t xml:space="preserve">El ángulo en radianes, separado del radio</w:t>
       </w:r>
     </w:p>
     <w:p>
@@ -7706,6 +8443,1082 @@
         <w:rPr>
           <w:rFonts w:ascii="Times New Roman" w:hAnsi="Times New Roman"/>
         </w:rPr>
+        <w:t xml:space="preserve">El sesgo polar mezcla dirección y longitud,</w:t>
+      </w:r>
+      <w:r>
+        <w:rPr>
+          <w:rFonts w:ascii="Times New Roman" w:hAnsi="Times New Roman"/>
+        </w:rPr>
+        <w:t xml:space="preserve"> </w:t>
+      </w:r>
+      <m:oMath>
+        <m:r>
+          <m:t>q</m:t>
+        </m:r>
+        <m:sSub>
+          <m:e>
+            <m:r>
+              <m:t>g</m:t>
+            </m:r>
+          </m:e>
+          <m:sub>
+            <m:r>
+              <m:t>Z</m:t>
+            </m:r>
+          </m:sub>
+        </m:sSub>
+        <m:r>
+          <m:rPr>
+            <m:sty m:val="p"/>
+          </m:rPr>
+          <m:t>=</m:t>
+        </m:r>
+        <m:r>
+          <m:t>r</m:t>
+        </m:r>
+        <m:r>
+          <m:rPr>
+            <m:sty m:val="p"/>
+          </m:rPr>
+          <m:t>cos</m:t>
+        </m:r>
+        <m:r>
+          <m:t>θ</m:t>
+        </m:r>
+      </m:oMath>
+      <w:r>
+        <w:rPr>
+          <w:rFonts w:ascii="Times New Roman" w:hAnsi="Times New Roman"/>
+        </w:rPr>
+        <w:t xml:space="preserve">, así que la lectura habitual del ángulo,</w:t>
+      </w:r>
+      <w:r>
+        <w:rPr>
+          <w:rFonts w:ascii="Times New Roman" w:hAnsi="Times New Roman"/>
+        </w:rPr>
+        <w:t xml:space="preserve"> </w:t>
+      </w:r>
+      <w:r>
+        <w:rPr>
+          <w:rFonts w:ascii="Times New Roman" w:hAnsi="Times New Roman"/>
+        </w:rPr>
+        <w:t xml:space="preserve">$\theta=\arccosqg_Z$</w:t>
+      </w:r>
+      <w:r>
+        <w:rPr>
+          <w:rFonts w:ascii="Times New Roman" w:hAnsi="Times New Roman"/>
+        </w:rPr>
+        <w:t xml:space="preserve">, se corre hacia</w:t>
+      </w:r>
+      <w:r>
+        <w:rPr>
+          <w:rFonts w:ascii="Times New Roman" w:hAnsi="Times New Roman"/>
+        </w:rPr>
+        <w:t xml:space="preserve"> </w:t>
+      </w:r>
+      <m:oMath>
+        <m:r>
+          <m:t>π</m:t>
+        </m:r>
+        <m:r>
+          <m:rPr>
+            <m:sty m:val="p"/>
+          </m:rPr>
+          <m:t>/</m:t>
+        </m:r>
+        <m:r>
+          <m:t>2</m:t>
+        </m:r>
+      </m:oMath>
+      <w:r>
+        <w:rPr>
+          <w:rFonts w:ascii="Times New Roman" w:hAnsi="Times New Roman"/>
+        </w:rPr>
+        <w:t xml:space="preserve"> </w:t>
+      </w:r>
+      <w:r>
+        <w:rPr>
+          <w:rFonts w:ascii="Times New Roman" w:hAnsi="Times New Roman"/>
+        </w:rPr>
+        <w:t xml:space="preserve">cada vez que el ruido acorta el vector. El radio los separa:</w:t>
+      </w:r>
+    </w:p>
+    <w:p>
+      <w:pPr>
+        <w:pStyle w:val="BodyText"/>
+      </w:pPr>
+      <m:oMathPara>
+        <m:oMathParaPr>
+          <m:jc m:val="center"/>
+        </m:oMathParaPr>
+        <m:oMath>
+          <m:r>
+            <m:t>θ</m:t>
+          </m:r>
+          <m:r>
+            <m:rPr>
+              <m:sty m:val="p"/>
+            </m:rPr>
+            <m:t>=</m:t>
+          </m:r>
+          <m:r>
+            <m:rPr>
+              <m:sty m:val="p"/>
+            </m:rPr>
+            <m:t>atan2</m:t>
+          </m:r>
+          <m:r>
+            <m:t>​</m:t>
+          </m:r>
+          <m:d>
+            <m:dPr>
+              <m:begChr m:val="("/>
+              <m:endChr m:val=")"/>
+              <m:sepChr m:val=""/>
+              <m:grow/>
+            </m:dPr>
+            <m:e>
+              <m:rad>
+                <m:radPr>
+                  <m:degHide m:val="on"/>
+                </m:radPr>
+                <m:deg/>
+                <m:e>
+                  <m:r>
+                    <m:t>q</m:t>
+                  </m:r>
+                  <m:sSubSup>
+                    <m:e>
+                      <m:r>
+                        <m:t>g</m:t>
+                      </m:r>
+                    </m:e>
+                    <m:sub>
+                      <m:r>
+                        <m:t>X</m:t>
+                      </m:r>
+                    </m:sub>
+                    <m:sup>
+                      <m:r>
+                        <m:t>2</m:t>
+                      </m:r>
+                    </m:sup>
+                  </m:sSubSup>
+                  <m:r>
+                    <m:rPr>
+                      <m:sty m:val="p"/>
+                    </m:rPr>
+                    <m:t>+</m:t>
+                  </m:r>
+                  <m:r>
+                    <m:t>q</m:t>
+                  </m:r>
+                  <m:sSubSup>
+                    <m:e>
+                      <m:r>
+                        <m:t>g</m:t>
+                      </m:r>
+                    </m:e>
+                    <m:sub>
+                      <m:r>
+                        <m:t>Y</m:t>
+                      </m:r>
+                    </m:sub>
+                    <m:sup>
+                      <m:r>
+                        <m:t>2</m:t>
+                      </m:r>
+                    </m:sup>
+                  </m:sSubSup>
+                </m:e>
+              </m:rad>
+              <m:r>
+                <m:rPr>
+                  <m:sty m:val="p"/>
+                </m:rPr>
+                <m:t>,</m:t>
+              </m:r>
+              <m:r>
+                <m:t> </m:t>
+              </m:r>
+              <m:r>
+                <m:t>q</m:t>
+              </m:r>
+              <m:sSub>
+                <m:e>
+                  <m:r>
+                    <m:t>g</m:t>
+                  </m:r>
+                </m:e>
+                <m:sub>
+                  <m:r>
+                    <m:t>Z</m:t>
+                  </m:r>
+                </m:sub>
+              </m:sSub>
+            </m:e>
+          </m:d>
+          <m:r>
+            <m:rPr>
+              <m:sty m:val="p"/>
+            </m:rPr>
+            <m:t>=</m:t>
+          </m:r>
+          <m:r>
+            <m:rPr>
+              <m:sty m:val="p"/>
+            </m:rPr>
+            <m:t>arccos</m:t>
+          </m:r>
+          <m:d>
+            <m:dPr>
+              <m:begChr m:val="("/>
+              <m:endChr m:val=")"/>
+              <m:sepChr m:val=""/>
+              <m:grow/>
+            </m:dPr>
+            <m:e>
+              <m:r>
+                <m:t>q</m:t>
+              </m:r>
+              <m:sSub>
+                <m:e>
+                  <m:r>
+                    <m:t>g</m:t>
+                  </m:r>
+                </m:e>
+                <m:sub>
+                  <m:r>
+                    <m:t>Z</m:t>
+                  </m:r>
+                </m:sub>
+              </m:sSub>
+              <m:r>
+                <m:rPr>
+                  <m:sty m:val="p"/>
+                </m:rPr>
+                <m:t>/</m:t>
+              </m:r>
+              <m:r>
+                <m:t>r</m:t>
+              </m:r>
+            </m:e>
+          </m:d>
+          <m:r>
+            <m:rPr>
+              <m:sty m:val="p"/>
+            </m:rPr>
+            <m:t>.</m:t>
+          </m:r>
+        </m:oMath>
+      </m:oMathPara>
+    </w:p>
+    <w:p>
+      <w:pPr>
+        <w:pStyle w:val="FirstParagraph"/>
+      </w:pPr>
+      <w:r>
+        <w:rPr>
+          <w:rFonts w:ascii="Times New Roman" w:hAnsi="Times New Roman"/>
+        </w:rPr>
+        <w:t xml:space="preserve">El ruido despolarizante deja la Ec. </w:t>
+      </w:r>
+      <w:hyperlink w:anchor="eq:theta">
+        <w:r>
+          <w:rPr>
+            <w:rStyle w:val="Hyperlink"/>
+          </w:rPr>
+          <w:t xml:space="preserve">[eq:theta]</w:t>
+        </w:r>
+      </w:hyperlink>
+      <w:r>
+        <w:rPr>
+          <w:rFonts w:ascii="Times New Roman" w:hAnsi="Times New Roman"/>
+        </w:rPr>
+        <w:t xml:space="preserve"> </w:t>
+      </w:r>
+      <w:r>
+        <w:rPr>
+          <w:rFonts w:ascii="Times New Roman" w:hAnsi="Times New Roman"/>
+        </w:rPr>
+        <w:t xml:space="preserve">igual; el desfase achica solo</w:t>
+      </w:r>
+      <w:r>
+        <w:rPr>
+          <w:rFonts w:ascii="Times New Roman" w:hAnsi="Times New Roman"/>
+        </w:rPr>
+        <w:t xml:space="preserve"> </w:t>
+      </w:r>
+      <m:oMath>
+        <m:r>
+          <m:t>q</m:t>
+        </m:r>
+        <m:sSub>
+          <m:e>
+            <m:r>
+              <m:t>g</m:t>
+            </m:r>
+          </m:e>
+          <m:sub>
+            <m:r>
+              <m:t>X</m:t>
+            </m:r>
+          </m:sub>
+        </m:sSub>
+        <m:r>
+          <m:rPr>
+            <m:sty m:val="p"/>
+          </m:rPr>
+          <m:t>,</m:t>
+        </m:r>
+        <m:r>
+          <m:t>q</m:t>
+        </m:r>
+        <m:sSub>
+          <m:e>
+            <m:r>
+              <m:t>g</m:t>
+            </m:r>
+          </m:e>
+          <m:sub>
+            <m:r>
+              <m:t>Y</m:t>
+            </m:r>
+          </m:sub>
+        </m:sSub>
+      </m:oMath>
+      <w:r>
+        <w:rPr>
+          <w:rFonts w:ascii="Times New Roman" w:hAnsi="Times New Roman"/>
+        </w:rPr>
+        <w:t xml:space="preserve"> </w:t>
+      </w:r>
+      <w:r>
+        <w:rPr>
+          <w:rFonts w:ascii="Times New Roman" w:hAnsi="Times New Roman"/>
+        </w:rPr>
+        <w:t xml:space="preserve">y la lleva hacia los</w:t>
+      </w:r>
+      <w:r>
+        <w:rPr>
+          <w:rFonts w:ascii="Times New Roman" w:hAnsi="Times New Roman"/>
+        </w:rPr>
+        <w:t xml:space="preserve"> </w:t>
+      </w:r>
+      <w:r>
+        <w:rPr>
+          <w:rFonts w:ascii="Times New Roman" w:hAnsi="Times New Roman"/>
+        </w:rPr>
+        <w:t xml:space="preserve">polos, mientras que</w:t>
+      </w:r>
+      <w:r>
+        <w:rPr>
+          <w:rFonts w:ascii="Times New Roman" w:hAnsi="Times New Roman"/>
+        </w:rPr>
+        <w:t xml:space="preserve"> </w:t>
+      </w:r>
+      <w:r>
+        <w:rPr>
+          <w:rFonts w:ascii="Times New Roman" w:hAnsi="Times New Roman"/>
+        </w:rPr>
+        <w:t xml:space="preserve">$\arccosqg_Z$</w:t>
+      </w:r>
+      <w:r>
+        <w:rPr>
+          <w:rFonts w:ascii="Times New Roman" w:hAnsi="Times New Roman"/>
+        </w:rPr>
+        <w:t xml:space="preserve"> </w:t>
+      </w:r>
+      <w:r>
+        <w:rPr>
+          <w:rFonts w:ascii="Times New Roman" w:hAnsi="Times New Roman"/>
+        </w:rPr>
+        <w:t xml:space="preserve">es entonces exacto; el amortiguamiento mueve los dos. Comparamos las dos lecturas con</w:t>
+      </w:r>
+      <w:r>
+        <w:rPr>
+          <w:rFonts w:ascii="Times New Roman" w:hAnsi="Times New Roman"/>
+        </w:rPr>
+        <w:t xml:space="preserve"> </w:t>
+      </w:r>
+      <w:r>
+        <w:rPr>
+          <w:rFonts w:ascii="Times New Roman" w:hAnsi="Times New Roman"/>
+        </w:rPr>
+        <w:t xml:space="preserve">el mismo total de disparos, 3000 por ángulo: con qang, la Ec. </w:t>
+      </w:r>
+      <w:hyperlink w:anchor="eq:theta">
+        <w:r>
+          <w:rPr>
+            <w:rStyle w:val="Hyperlink"/>
+          </w:rPr>
+          <w:t xml:space="preserve">[eq:theta]</w:t>
+        </w:r>
+      </w:hyperlink>
+      <w:r>
+        <w:rPr>
+          <w:rFonts w:ascii="Times New Roman" w:hAnsi="Times New Roman"/>
+        </w:rPr>
+        <w:t xml:space="preserve"> </w:t>
+      </w:r>
+      <w:r>
+        <w:rPr>
+          <w:rFonts w:ascii="Times New Roman" w:hAnsi="Times New Roman"/>
+        </w:rPr>
+        <w:t xml:space="preserve">con 1000 disparos en cada base X, Y, Z</w:t>
+      </w:r>
+      <w:r>
+        <w:rPr>
+          <w:rFonts w:ascii="Times New Roman" w:hAnsi="Times New Roman"/>
+        </w:rPr>
+        <w:t xml:space="preserve"> </w:t>
+      </w:r>
+      <w:r>
+        <w:rPr>
+          <w:rFonts w:ascii="Times New Roman" w:hAnsi="Times New Roman"/>
+        </w:rPr>
+        <w:t xml:space="preserve">(la parte ecuatorial con cuadrados insesgados); sin qang,</w:t>
+      </w:r>
+      <w:r>
+        <w:rPr>
+          <w:rFonts w:ascii="Times New Roman" w:hAnsi="Times New Roman"/>
+        </w:rPr>
+        <w:t xml:space="preserve"> </w:t>
+      </w:r>
+      <w:r>
+        <w:rPr>
+          <w:rFonts w:ascii="Times New Roman" w:hAnsi="Times New Roman"/>
+        </w:rPr>
+        <w:t xml:space="preserve">$\arccosqg_Z$</w:t>
+      </w:r>
+      <w:r>
+        <w:rPr>
+          <w:rFonts w:ascii="Times New Roman" w:hAnsi="Times New Roman"/>
+        </w:rPr>
+        <w:t xml:space="preserve"> </w:t>
+      </w:r>
+      <w:r>
+        <w:rPr>
+          <w:rFonts w:ascii="Times New Roman" w:hAnsi="Times New Roman"/>
+        </w:rPr>
+        <w:t xml:space="preserve">con 3000 disparos en Z (RESEARCH_NOTES §102,</w:t>
+      </w:r>
+      <w:r>
+        <w:rPr>
+          <w:rFonts w:ascii="Times New Roman" w:hAnsi="Times New Roman"/>
+        </w:rPr>
+        <w:t xml:space="preserve"> </w:t>
+      </w:r>
+      <w:r>
+        <w:rPr>
+          <w:rFonts w:ascii="Times New Roman" w:hAnsi="Times New Roman"/>
+        </w:rPr>
+        <w:t xml:space="preserve">seis predicciones).</w:t>
+      </w:r>
+    </w:p>
+    <w:bookmarkStart w:id="32" w:name="tab:theta"/>
+    <w:p>
+      <w:pPr>
+        <w:pStyle w:val="TableCaption"/>
+      </w:pPr>
+      <w:r>
+        <w:rPr>
+          <w:rFonts w:ascii="Times New Roman" w:hAnsi="Times New Roman"/>
+          <w:sz w:val="18"/>
+        </w:rPr>
+        <w:t xml:space="preserve">Error absoluto medio del ángulo polar (rad). Simulación: valores exactos; modelos de ruido de equipos: 3000</w:t>
+      </w:r>
+      <w:r>
+        <w:rPr>
+          <w:rFonts w:ascii="Times New Roman" w:hAnsi="Times New Roman"/>
+          <w:sz w:val="18"/>
+        </w:rPr>
+        <w:t xml:space="preserve"> </w:t>
+      </w:r>
+      <w:r>
+        <w:rPr>
+          <w:rFonts w:ascii="Times New Roman" w:hAnsi="Times New Roman"/>
+          <w:sz w:val="18"/>
+        </w:rPr>
+        <w:t xml:space="preserve">disparos por ángulo.</w:t>
+      </w:r>
+    </w:p>
+    <w:tbl>
+      <w:tblPr>
+        <w:tblStyle w:val="Table"/>
+        <w:tblW w:type="auto" w:w="0"/>
+        <w:tblLook w:firstRow="1" w:lastRow="0" w:firstColumn="0" w:lastColumn="0" w:noHBand="0" w:noVBand="0" w:val="0020"/>
+        <w:jc w:val="start"/>
+        <w:tblCaption w:val="Error absoluto medio del ángulo polar (rad). Simulación: valores exactos; modelos de ruido de equipos: 3000 disparos por ángulo."/>
+      </w:tblPr>
+      <w:tblGrid>
+        <w:gridCol w:w="2640"/>
+        <w:gridCol w:w="2640"/>
+        <w:gridCol w:w="2640"/>
+      </w:tblGrid>
+      <w:tr>
+        <w:trPr>
+          <w:tblHeader w:val="true"/>
+        </w:trPr>
+        <w:tc>
+          <w:tcPr/>
+          <w:p>
+            <w:pPr>
+              <w:pStyle w:val="Compact"/>
+              <w:jc w:val="left"/>
+            </w:pPr>
+            <w:r>
+              <w:t xml:space="preserve">ruido (simulación, 31 ángulos)</w:t>
+            </w:r>
+          </w:p>
+        </w:tc>
+        <w:tc>
+          <w:tcPr/>
+          <w:p>
+            <w:pPr>
+              <w:pStyle w:val="Compact"/>
+              <w:jc w:val="center"/>
+            </w:pPr>
+            <w:r>
+              <w:t xml:space="preserve">con qang</w:t>
+            </w:r>
+          </w:p>
+        </w:tc>
+        <w:tc>
+          <w:tcPr/>
+          <w:p>
+            <w:pPr>
+              <w:pStyle w:val="Compact"/>
+              <w:jc w:val="center"/>
+            </w:pPr>
+            <w:r>
+              <w:t xml:space="preserve">sin qang</w:t>
+            </w:r>
+          </w:p>
+        </w:tc>
+      </w:tr>
+      <w:tr>
+        <w:tc>
+          <w:tcPr/>
+          <w:p>
+            <w:pPr>
+              <w:pStyle w:val="Compact"/>
+              <w:jc w:val="left"/>
+            </w:pPr>
+            <w:r>
+              <w:t xml:space="preserve">despolarizante 0.1 / 0.2 / 0.3</w:t>
+            </w:r>
+          </w:p>
+        </w:tc>
+        <w:tc>
+          <w:tcPr/>
+          <w:p>
+            <w:pPr>
+              <w:pStyle w:val="Compact"/>
+              <w:jc w:val="center"/>
+            </w:pPr>
+            <w:r>
+              <w:t xml:space="preserve">0 / 0 / 0</w:t>
+            </w:r>
+          </w:p>
+        </w:tc>
+        <w:tc>
+          <w:tcPr/>
+          <w:p>
+            <w:pPr>
+              <w:pStyle w:val="Compact"/>
+              <w:jc w:val="center"/>
+            </w:pPr>
+            <w:r>
+              <w:t xml:space="preserve">0.122 / 0.213 / 0.294</w:t>
+            </w:r>
+          </w:p>
+        </w:tc>
+      </w:tr>
+      <w:tr>
+        <w:tc>
+          <w:tcPr/>
+          <w:p>
+            <w:pPr>
+              <w:pStyle w:val="Compact"/>
+              <w:jc w:val="left"/>
+            </w:pPr>
+            <w:r>
+              <w:t xml:space="preserve">desfase, coherencia 0.9 / 0.8 / 0.7</w:t>
+            </w:r>
+          </w:p>
+        </w:tc>
+        <w:tc>
+          <w:tcPr/>
+          <w:p>
+            <w:pPr>
+              <w:pStyle w:val="Compact"/>
+              <w:jc w:val="center"/>
+            </w:pPr>
+            <w:r>
+              <w:t xml:space="preserve">0.035 / 0.073 / 0.116</w:t>
+            </w:r>
+          </w:p>
+        </w:tc>
+        <w:tc>
+          <w:tcPr/>
+          <w:p>
+            <w:pPr>
+              <w:pStyle w:val="Compact"/>
+              <w:jc w:val="center"/>
+            </w:pPr>
+            <w:r>
+              <w:t xml:space="preserve">0 / 0 / 0</w:t>
+            </w:r>
+          </w:p>
+        </w:tc>
+      </w:tr>
+      <w:tr>
+        <w:tc>
+          <w:tcPr/>
+          <w:p>
+            <w:pPr>
+              <w:pStyle w:val="Compact"/>
+              <w:jc w:val="left"/>
+            </w:pPr>
+            <w:r>
+              <w:t xml:space="preserve">amortiguamiento 0.1 / 0.2 / 0.3</w:t>
+            </w:r>
+          </w:p>
+        </w:tc>
+        <w:tc>
+          <w:tcPr/>
+          <w:p>
+            <w:pPr>
+              <w:pStyle w:val="Compact"/>
+              <w:jc w:val="center"/>
+            </w:pPr>
+            <w:r>
+              <w:t xml:space="preserve">0.072 / 0.159 / 0.270</w:t>
+            </w:r>
+          </w:p>
+        </w:tc>
+        <w:tc>
+          <w:tcPr/>
+          <w:p>
+            <w:pPr>
+              <w:pStyle w:val="Compact"/>
+              <w:jc w:val="center"/>
+            </w:pPr>
+            <w:r>
+              <w:t xml:space="preserve">0.150 / 0.270 / 0.382</w:t>
+            </w:r>
+          </w:p>
+        </w:tc>
+      </w:tr>
+      <w:tr>
+        <w:tc>
+          <w:tcPr/>
+          <w:p>
+            <w:pPr>
+              <w:pStyle w:val="Compact"/>
+              <w:jc w:val="left"/>
+            </w:pPr>
+            <w:r>
+              <w:t xml:space="preserve">modelo de ruido de equipo (11 ángulos, 16 compuertas de 2 qubits)</w:t>
+            </w:r>
+          </w:p>
+        </w:tc>
+        <w:tc>
+          <w:tcPr/>
+          <w:p>
+            <w:pPr>
+              <w:pStyle w:val="Compact"/>
+            </w:pPr>
+          </w:p>
+        </w:tc>
+        <w:tc>
+          <w:tcPr/>
+          <w:p>
+            <w:pPr>
+              <w:pStyle w:val="Compact"/>
+            </w:pPr>
+          </w:p>
+        </w:tc>
+      </w:tr>
+      <w:tr>
+        <w:tc>
+          <w:tcPr/>
+          <w:p>
+            <w:pPr>
+              <w:pStyle w:val="Compact"/>
+              <w:jc w:val="left"/>
+            </w:pPr>
+            <w:r>
+              <w:t xml:space="preserve">IBM brisbane / sherbrooke / torino</w:t>
+            </w:r>
+          </w:p>
+        </w:tc>
+        <w:tc>
+          <w:tcPr/>
+          <w:p>
+            <w:pPr>
+              <w:pStyle w:val="Compact"/>
+              <w:jc w:val="center"/>
+            </w:pPr>
+            <w:r>
+              <w:t xml:space="preserve">0.053 / 0.029 / 0.041</w:t>
+            </w:r>
+          </w:p>
+        </w:tc>
+        <w:tc>
+          <w:tcPr/>
+          <w:p>
+            <w:pPr>
+              <w:pStyle w:val="Compact"/>
+              <w:jc w:val="center"/>
+            </w:pPr>
+            <w:r>
+              <w:t xml:space="preserve">0.267 / 0.207 / 0.374</w:t>
+            </w:r>
+          </w:p>
+        </w:tc>
+      </w:tr>
+      <w:tr>
+        <w:tc>
+          <w:tcPr/>
+          <w:p>
+            <w:pPr>
+              <w:pStyle w:val="Compact"/>
+              <w:jc w:val="left"/>
+            </w:pPr>
+            <w:r>
+              <w:t xml:space="preserve">IonQ aria-1 / forte-1, compuertas nativas</w:t>
+            </w:r>
+          </w:p>
+        </w:tc>
+        <w:tc>
+          <w:tcPr/>
+          <w:p>
+            <w:pPr>
+              <w:pStyle w:val="Compact"/>
+              <w:jc w:val="center"/>
+            </w:pPr>
+            <w:r>
+              <w:t xml:space="preserve">0.028 / 0.026</w:t>
+            </w:r>
+          </w:p>
+        </w:tc>
+        <w:tc>
+          <w:tcPr/>
+          <w:p>
+            <w:pPr>
+              <w:pStyle w:val="Compact"/>
+              <w:jc w:val="center"/>
+            </w:pPr>
+            <w:r>
+              <w:t xml:space="preserve">0.249 / 0.226</w:t>
+            </w:r>
+          </w:p>
+        </w:tc>
+      </w:tr>
+    </w:tbl>
+    <w:bookmarkEnd w:id="32"/>
+    <w:p>
+      <w:pPr>
+        <w:pStyle w:val="BodyText"/>
+      </w:pPr>
+      <w:r>
+        <w:rPr>
+          <w:rFonts w:ascii="Times New Roman" w:hAnsi="Times New Roman"/>
+        </w:rPr>
+        <w:t xml:space="preserve">Con ruido despolarizante la Ec. </w:t>
+      </w:r>
+      <w:hyperlink w:anchor="eq:theta">
+        <w:r>
+          <w:rPr>
+            <w:rStyle w:val="Hyperlink"/>
+          </w:rPr>
+          <w:t xml:space="preserve">[eq:theta]</w:t>
+        </w:r>
+      </w:hyperlink>
+      <w:r>
+        <w:rPr>
+          <w:rFonts w:ascii="Times New Roman" w:hAnsi="Times New Roman"/>
+        </w:rPr>
+        <w:t xml:space="preserve"> </w:t>
+      </w:r>
+      <w:r>
+        <w:rPr>
+          <w:rFonts w:ascii="Times New Roman" w:hAnsi="Times New Roman"/>
+        </w:rPr>
+        <w:t xml:space="preserve">es exacta, mientras que</w:t>
+      </w:r>
+      <w:r>
+        <w:rPr>
+          <w:rFonts w:ascii="Times New Roman" w:hAnsi="Times New Roman"/>
+        </w:rPr>
+        <w:t xml:space="preserve"> </w:t>
+      </w:r>
+      <w:r>
+        <w:rPr>
+          <w:rFonts w:ascii="Times New Roman" w:hAnsi="Times New Roman"/>
+        </w:rPr>
+        <w:t xml:space="preserve">$\arccosqg_Z$</w:t>
+      </w:r>
+      <w:r>
+        <w:rPr>
+          <w:rFonts w:ascii="Times New Roman" w:hAnsi="Times New Roman"/>
+        </w:rPr>
+        <w:t xml:space="preserve"> </w:t>
+      </w:r>
+      <w:r>
+        <w:rPr>
+          <w:rFonts w:ascii="Times New Roman" w:hAnsi="Times New Roman"/>
+        </w:rPr>
+        <w:t xml:space="preserve">se equivoca hasta 0.70 rad cerca</w:t>
+      </w:r>
+      <w:r>
+        <w:rPr>
+          <w:rFonts w:ascii="Times New Roman" w:hAnsi="Times New Roman"/>
+        </w:rPr>
+        <w:t xml:space="preserve"> </w:t>
+      </w:r>
+      <w:r>
+        <w:rPr>
+          <w:rFonts w:ascii="Times New Roman" w:hAnsi="Times New Roman"/>
+        </w:rPr>
+        <w:t xml:space="preserve">de los polos; con disparos su error cuadrático medio es 5.8 veces menor con</w:t>
+      </w:r>
+      <w:r>
+        <w:rPr>
+          <w:rFonts w:ascii="Times New Roman" w:hAnsi="Times New Roman"/>
+        </w:rPr>
+        <w:t xml:space="preserve"> </w:t>
+      </w:r>
+      <m:oMath>
+        <m:r>
+          <m:t>p</m:t>
+        </m:r>
+        <m:r>
+          <m:rPr>
+            <m:sty m:val="p"/>
+          </m:rPr>
+          <m:t>=</m:t>
+        </m:r>
+        <m:r>
+          <m:t>0.2</m:t>
+        </m:r>
+      </m:oMath>
+      <w:r>
+        <w:rPr>
+          <w:rFonts w:ascii="Times New Roman" w:hAnsi="Times New Roman"/>
+        </w:rPr>
+        <w:t xml:space="preserve">. Con desfase pierde, como estaba</w:t>
+      </w:r>
+      <w:r>
+        <w:rPr>
+          <w:rFonts w:ascii="Times New Roman" w:hAnsi="Times New Roman"/>
+        </w:rPr>
+        <w:t xml:space="preserve"> </w:t>
+      </w:r>
+      <w:r>
+        <w:rPr>
+          <w:rFonts w:ascii="Times New Roman" w:hAnsi="Times New Roman"/>
+        </w:rPr>
+        <w:t xml:space="preserve">previsto, y sin ruido las tres bases cuestan un factor 1.6. Con amortiguamiento se equivoca entre un 29 y un 52 %</w:t>
+      </w:r>
+      <w:r>
+        <w:rPr>
+          <w:rFonts w:ascii="Times New Roman" w:hAnsi="Times New Roman"/>
+        </w:rPr>
+        <w:t xml:space="preserve"> </w:t>
+      </w:r>
+      <w:r>
+        <w:rPr>
+          <w:rFonts w:ascii="Times New Roman" w:hAnsi="Times New Roman"/>
+        </w:rPr>
+        <w:t xml:space="preserve">menos. En los modelos de ruido de IBM el vector se achica casi de manera uniforme y la Ec. </w:t>
+      </w:r>
+      <w:hyperlink w:anchor="eq:theta">
+        <w:r>
+          <w:rPr>
+            <w:rStyle w:val="Hyperlink"/>
+          </w:rPr>
+          <w:t xml:space="preserve">[eq:theta]</w:t>
+        </w:r>
+      </w:hyperlink>
+      <w:r>
+        <w:rPr>
+          <w:rFonts w:ascii="Times New Roman" w:hAnsi="Times New Roman"/>
+        </w:rPr>
+        <w:t xml:space="preserve"> </w:t>
+      </w:r>
+      <w:r>
+        <w:rPr>
+          <w:rFonts w:ascii="Times New Roman" w:hAnsi="Times New Roman"/>
+        </w:rPr>
+        <w:t xml:space="preserve">es entre 5</w:t>
+      </w:r>
+      <w:r>
+        <w:rPr>
+          <w:rFonts w:ascii="Times New Roman" w:hAnsi="Times New Roman"/>
+        </w:rPr>
+        <w:t xml:space="preserve"> </w:t>
+      </w:r>
+      <w:r>
+        <w:rPr>
+          <w:rFonts w:ascii="Times New Roman" w:hAnsi="Times New Roman"/>
+        </w:rPr>
+        <w:t xml:space="preserve">y 9 veces más precisa. En el simulador de IonQ la primera corrida falló: el compilador de IonQ eliminó el bloque de</w:t>
+      </w:r>
+      <w:r>
+        <w:rPr>
+          <w:rFonts w:ascii="Times New Roman" w:hAnsi="Times New Roman"/>
+        </w:rPr>
+        <w:t xml:space="preserve"> </w:t>
+      </w:r>
+      <w:r>
+        <w:rPr>
+          <w:rFonts w:ascii="Times New Roman" w:hAnsi="Times New Roman"/>
+        </w:rPr>
+        <w:t xml:space="preserve">ruido (pares de CX que se cancelan), así que el vector no se achicó y ganaron los disparos extra en Z. Un estudio</w:t>
+      </w:r>
+      <w:r>
+        <w:rPr>
+          <w:rFonts w:ascii="Times New Roman" w:hAnsi="Times New Roman"/>
+        </w:rPr>
+        <w:t xml:space="preserve"> </w:t>
+      </w:r>
+      <w:r>
+        <w:rPr>
+          <w:rFonts w:ascii="Times New Roman" w:hAnsi="Times New Roman"/>
+        </w:rPr>
+        <w:t xml:space="preserve">posterior con sus propias predicciones (§103) lo confirmó: con el conjunto de compuertas estándar de IonQ el bloque no</w:t>
+      </w:r>
+      <w:r>
+        <w:rPr>
+          <w:rFonts w:ascii="Times New Roman" w:hAnsi="Times New Roman"/>
+        </w:rPr>
+        <w:t xml:space="preserve"> </w:t>
+      </w:r>
+      <w:r>
+        <w:rPr>
+          <w:rFonts w:ascii="Times New Roman" w:hAnsi="Times New Roman"/>
+        </w:rPr>
+        <w:t xml:space="preserve">cambió nada, y enviado como 16 compuertas nativas MS, que IonQ ejecuta tal cual, achicó el vector y la</w:t>
+      </w:r>
+      <w:r>
+        <w:rPr>
+          <w:rFonts w:ascii="Times New Roman" w:hAnsi="Times New Roman"/>
+        </w:rPr>
+        <w:t xml:space="preserve"> </w:t>
+      </w:r>
+      <w:r>
+        <w:rPr>
+          <w:rFonts w:ascii="Times New Roman" w:hAnsi="Times New Roman"/>
+        </w:rPr>
+        <w:t xml:space="preserve">Ec. </w:t>
+      </w:r>
+      <w:hyperlink w:anchor="eq:theta">
+        <w:r>
+          <w:rPr>
+            <w:rStyle w:val="Hyperlink"/>
+          </w:rPr>
+          <w:t xml:space="preserve">[eq:theta]</w:t>
+        </w:r>
+      </w:hyperlink>
+      <w:r>
+        <w:rPr>
+          <w:rFonts w:ascii="Times New Roman" w:hAnsi="Times New Roman"/>
+        </w:rPr>
+        <w:t xml:space="preserve"> </w:t>
+      </w:r>
+      <w:r>
+        <w:rPr>
+          <w:rFonts w:ascii="Times New Roman" w:hAnsi="Times New Roman"/>
+        </w:rPr>
+        <w:t xml:space="preserve">fue entre 8.7 y 9.0 veces más precisa. La regla es simple: si el radio medido es casi 1, conviene</w:t>
+      </w:r>
+      <w:r>
+        <w:rPr>
+          <w:rFonts w:ascii="Times New Roman" w:hAnsi="Times New Roman"/>
+        </w:rPr>
+        <w:t xml:space="preserve"> </w:t>
+      </w:r>
+      <w:r>
+        <w:rPr>
+          <w:rFonts w:ascii="Times New Roman" w:hAnsi="Times New Roman"/>
+        </w:rPr>
+        <w:t xml:space="preserve">$\arccosqg_Z$</w:t>
+      </w:r>
+      <w:r>
+        <w:rPr>
+          <w:rFonts w:ascii="Times New Roman" w:hAnsi="Times New Roman"/>
+        </w:rPr>
+        <w:t xml:space="preserve"> </w:t>
+      </w:r>
+      <w:r>
+        <w:rPr>
+          <w:rFonts w:ascii="Times New Roman" w:hAnsi="Times New Roman"/>
+        </w:rPr>
+        <w:t xml:space="preserve">con todos los disparos en Z; si está claramente por debajo de 1 y el ruido no es solo desfase, conviene la</w:t>
+      </w:r>
+      <w:r>
+        <w:rPr>
+          <w:rFonts w:ascii="Times New Roman" w:hAnsi="Times New Roman"/>
+        </w:rPr>
+        <w:t xml:space="preserve"> </w:t>
+      </w:r>
+      <w:r>
+        <w:rPr>
+          <w:rFonts w:ascii="Times New Roman" w:hAnsi="Times New Roman"/>
+        </w:rPr>
+        <w:t xml:space="preserve">Ec. </w:t>
+      </w:r>
+      <w:hyperlink w:anchor="eq:theta">
+        <w:r>
+          <w:rPr>
+            <w:rStyle w:val="Hyperlink"/>
+          </w:rPr>
+          <w:t xml:space="preserve">[eq:theta]</w:t>
+        </w:r>
+      </w:hyperlink>
+      <w:r>
+        <w:rPr>
+          <w:rFonts w:ascii="Times New Roman" w:hAnsi="Times New Roman"/>
+        </w:rPr>
+        <w:t xml:space="preserve">. Los circuitos que contienen identidades, como los de eco de arriba, requieren en IonQ el conjunto</w:t>
+      </w:r>
+      <w:r>
+        <w:rPr>
+          <w:rFonts w:ascii="Times New Roman" w:hAnsi="Times New Roman"/>
+        </w:rPr>
+        <w:t xml:space="preserve"> </w:t>
+      </w:r>
+      <w:r>
+        <w:rPr>
+          <w:rFonts w:ascii="Times New Roman" w:hAnsi="Times New Roman"/>
+        </w:rPr>
+        <w:t xml:space="preserve">de compuertas nativo.</w:t>
+      </w:r>
+    </w:p>
+    <w:bookmarkEnd w:id="33"/>
+    <w:bookmarkStart w:id="36" w:name="discusión"/>
+    <w:p>
+      <w:pPr>
+        <w:pStyle w:val="Heading1"/>
+      </w:pPr>
+      <w:r>
+        <w:rPr>
+          <w:rFonts w:ascii="Times New Roman" w:hAnsi="Times New Roman"/>
+        </w:rPr>
+        <w:t xml:space="preserve">Discusión</w:t>
+      </w:r>
+    </w:p>
+    <w:p>
+      <w:pPr>
+        <w:pStyle w:val="FirstParagraph"/>
+      </w:pPr>
+      <w:r>
+        <w:rPr>
+          <w:rFonts w:ascii="Times New Roman" w:hAnsi="Times New Roman"/>
+        </w:rPr>
         <w:t xml:space="preserve">El radio mide entrelazamiento solo si el registro es puro. La conservación del peso y el filtro qg lo garantizan</w:t>
       </w:r>
       <w:r>
@@ -7799,7 +9612,7 @@
         <w:t xml:space="preserve">ejemplo el circuito de eco usado aquí, o un modelo de error.</w:t>
       </w:r>
     </w:p>
-    <w:bookmarkStart w:id="32" w:name="qué-es-nuevo-y-qué-no."/>
+    <w:bookmarkStart w:id="34" w:name="qué-es-nuevo-y-qué-no."/>
     <w:p>
       <w:pPr>
         <w:pStyle w:val="Heading4"/>
@@ -8056,11 +9869,11 @@
         <w:rPr>
           <w:rFonts w:ascii="Times New Roman" w:hAnsi="Times New Roman"/>
         </w:rPr>
-        <w:t xml:space="preserve">predicción registrada antes de su corrida.</w:t>
+        <w:t xml:space="preserve">predicción registrada antes de su corrida, y el ángulo en radianes que el radio libera del ruido.</w:t>
       </w:r>
     </w:p>
-    <w:bookmarkEnd w:id="32"/>
-    <w:bookmarkStart w:id="33" w:name="limitaciones."/>
+    <w:bookmarkEnd w:id="34"/>
+    <w:bookmarkStart w:id="35" w:name="limitaciones."/>
     <w:p>
       <w:pPr>
         <w:pStyle w:val="Heading4"/>
@@ -8107,9 +9920,9 @@
         <w:t xml:space="preserve">ventaja cuántica.</w:t>
       </w:r>
     </w:p>
-    <w:bookmarkEnd w:id="33"/>
-    <w:bookmarkEnd w:id="34"/>
-    <w:bookmarkStart w:id="36" w:name="disponibilidad-de-código-y-datos"/>
+    <w:bookmarkEnd w:id="35"/>
+    <w:bookmarkEnd w:id="36"/>
+    <w:bookmarkStart w:id="38" w:name="disponibilidad-de-código-y-datos"/>
     <w:p>
       <w:pPr>
         <w:pStyle w:val="Heading1"/>
@@ -8154,7 +9967,7 @@
         <w:rPr>
           <w:rFonts w:ascii="Times New Roman" w:hAnsi="Times New Roman"/>
         </w:rPr>
-        <w:t xml:space="preserve">0.6.6 (MIT,</w:t>
+        <w:t xml:space="preserve">0.6.8 (MIT,</w:t>
       </w:r>
       <w:r>
         <w:rPr>
@@ -8325,6 +10138,25 @@
         <w:rPr>
           <w:rFonts w:ascii="Times New Roman" w:hAnsi="Times New Roman"/>
         </w:rPr>
+        <w:t xml:space="preserve">,</w:t>
+      </w:r>
+      <w:r>
+        <w:rPr>
+          <w:rFonts w:ascii="Times New Roman" w:hAnsi="Times New Roman"/>
+        </w:rPr>
+        <w:t xml:space="preserve"> </w:t>
+      </w:r>
+      <w:r>
+        <w:rPr>
+          <w:rStyle w:val="VerbatimChar"/>
+          <w:rFonts w:ascii="Times New Roman" w:hAnsi="Times New Roman"/>
+        </w:rPr>
+        <w:t xml:space="preserve">direction_from_qg</w:t>
+      </w:r>
+      <w:r>
+        <w:rPr>
+          <w:rFonts w:ascii="Times New Roman" w:hAnsi="Times New Roman"/>
+        </w:rPr>
         <w:t xml:space="preserve">),</w:t>
       </w:r>
       <w:r>
@@ -8382,6 +10214,25 @@
         <w:rPr>
           <w:rFonts w:ascii="Times New Roman" w:hAnsi="Times New Roman"/>
         </w:rPr>
+        <w:t xml:space="preserve">,</w:t>
+      </w:r>
+      <w:r>
+        <w:rPr>
+          <w:rFonts w:ascii="Times New Roman" w:hAnsi="Times New Roman"/>
+        </w:rPr>
+        <w:t xml:space="preserve"> </w:t>
+      </w:r>
+      <w:r>
+        <w:rPr>
+          <w:rStyle w:val="VerbatimChar"/>
+          <w:rFonts w:ascii="Times New Roman" w:hAnsi="Times New Roman"/>
+        </w:rPr>
+        <w:t xml:space="preserve">direction_estimate</w:t>
+      </w:r>
+      <w:r>
+        <w:rPr>
+          <w:rFonts w:ascii="Times New Roman" w:hAnsi="Times New Roman"/>
+        </w:rPr>
         <w:t xml:space="preserve">). Estudios:</w:t>
       </w:r>
       <w:r>
@@ -8432,7 +10283,7 @@
         <w:rPr>
           <w:rFonts w:ascii="Times New Roman" w:hAnsi="Times New Roman"/>
         </w:rPr>
-        <w:t xml:space="preserve">(§100), con las predicciones en su encabezado y pruebas en</w:t>
+        <w:t xml:space="preserve">(§100),</w:t>
       </w:r>
       <w:r>
         <w:rPr>
@@ -8445,6 +10296,56 @@
           <w:rStyle w:val="VerbatimChar"/>
           <w:rFonts w:ascii="Times New Roman" w:hAnsi="Times New Roman"/>
         </w:rPr>
+        <w:t xml:space="preserve">examples/qg_direction_radians_qg.py</w:t>
+      </w:r>
+      <w:r>
+        <w:rPr>
+          <w:rFonts w:ascii="Times New Roman" w:hAnsi="Times New Roman"/>
+        </w:rPr>
+        <w:t xml:space="preserve"> </w:t>
+      </w:r>
+      <w:r>
+        <w:rPr>
+          <w:rFonts w:ascii="Times New Roman" w:hAnsi="Times New Roman"/>
+        </w:rPr>
+        <w:t xml:space="preserve">(§102) y</w:t>
+      </w:r>
+      <w:r>
+        <w:rPr>
+          <w:rFonts w:ascii="Times New Roman" w:hAnsi="Times New Roman"/>
+        </w:rPr>
+        <w:t xml:space="preserve"> </w:t>
+      </w:r>
+      <w:r>
+        <w:rPr>
+          <w:rStyle w:val="VerbatimChar"/>
+          <w:rFonts w:ascii="Times New Roman" w:hAnsi="Times New Roman"/>
+        </w:rPr>
+        <w:t xml:space="preserve">examples/qg_direction_ionq_native_qg.py</w:t>
+      </w:r>
+      <w:r>
+        <w:rPr>
+          <w:rFonts w:ascii="Times New Roman" w:hAnsi="Times New Roman"/>
+        </w:rPr>
+        <w:t xml:space="preserve"> </w:t>
+      </w:r>
+      <w:r>
+        <w:rPr>
+          <w:rFonts w:ascii="Times New Roman" w:hAnsi="Times New Roman"/>
+        </w:rPr>
+        <w:t xml:space="preserve">(§103), con las predicciones en su encabezado y pruebas en</w:t>
+      </w:r>
+      <w:r>
+        <w:rPr>
+          <w:rFonts w:ascii="Times New Roman" w:hAnsi="Times New Roman"/>
+        </w:rPr>
+        <w:t xml:space="preserve"> </w:t>
+      </w:r>
+      <w:r>
+        <w:rPr>
+          <w:rStyle w:val="VerbatimChar"/>
+          <w:rFonts w:ascii="Times New Roman" w:hAnsi="Times New Roman"/>
+        </w:rPr>
         <w:t xml:space="preserve">tests/</w:t>
       </w:r>
       <w:r>
@@ -8478,7 +10379,7 @@
         </w:rPr>
         <w:t xml:space="preserve"> </w:t>
       </w:r>
-      <w:hyperlink r:id="rId35">
+      <w:hyperlink r:id="rId37">
         <w:r>
           <w:rPr>
             <w:rStyle w:val="Hyperlink"/>
@@ -8493,8 +10394,8 @@
         <w:t xml:space="preserve">.</w:t>
       </w:r>
     </w:p>
-    <w:bookmarkEnd w:id="36"/>
-    <w:bookmarkStart w:id="53" w:name="uso-de-herramientas-de-ia"/>
+    <w:bookmarkEnd w:id="38"/>
+    <w:bookmarkStart w:id="55" w:name="uso-de-herramientas-de-ia"/>
     <w:p>
       <w:pPr>
         <w:pStyle w:val="Heading1"/>
@@ -8529,8 +10430,8 @@
         <w:t xml:space="preserve">redacción. El autor propuso la métrica de superficie, planteó las preguntas y revisó y validó todo el material.</w:t>
       </w:r>
     </w:p>
-    <w:bookmarkStart w:id="52" w:name="refs"/>
-    <w:bookmarkStart w:id="37" w:name="ref-bonetmonroig2018"/>
+    <w:bookmarkStart w:id="54" w:name="refs"/>
+    <w:bookmarkStart w:id="39" w:name="ref-bonetmonroig2018"/>
     <w:p>
       <w:pPr>
         <w:pStyle w:val="Bibliography"/>
@@ -8580,8 +10481,8 @@
         <w:t xml:space="preserve">98: 062339.</w:t>
       </w:r>
     </w:p>
-    <w:bookmarkEnd w:id="37"/>
-    <w:bookmarkStart w:id="38" w:name="ref-brennen2003"/>
+    <w:bookmarkEnd w:id="39"/>
+    <w:bookmarkStart w:id="40" w:name="ref-brennen2003"/>
     <w:p>
       <w:pPr>
         <w:pStyle w:val="Bibliography"/>
@@ -8631,8 +10532,8 @@
         <w:t xml:space="preserve">3: 619–26.</w:t>
       </w:r>
     </w:p>
-    <w:bookmarkEnd w:id="38"/>
-    <w:bookmarkStart w:id="40" w:name="ref-coffman2000"/>
+    <w:bookmarkEnd w:id="40"/>
+    <w:bookmarkStart w:id="42" w:name="ref-coffman2000"/>
     <w:p>
       <w:pPr>
         <w:pStyle w:val="Bibliography"/>
@@ -8687,7 +10588,7 @@
         </w:rPr>
         <w:t xml:space="preserve"> </w:t>
       </w:r>
-      <w:hyperlink r:id="rId39">
+      <w:hyperlink r:id="rId41">
         <w:r>
           <w:rPr>
             <w:rStyle w:val="Hyperlink"/>
@@ -8702,8 +10603,8 @@
         <w:t xml:space="preserve">.</w:t>
       </w:r>
     </w:p>
-    <w:bookmarkEnd w:id="40"/>
-    <w:bookmarkStart w:id="41" w:name="ref-mcardle2019"/>
+    <w:bookmarkEnd w:id="42"/>
+    <w:bookmarkStart w:id="43" w:name="ref-mcardle2019"/>
     <w:p>
       <w:pPr>
         <w:pStyle w:val="Bibliography"/>
@@ -8753,8 +10654,8 @@
         <w:t xml:space="preserve">122: 180501.</w:t>
       </w:r>
     </w:p>
-    <w:bookmarkEnd w:id="41"/>
-    <w:bookmarkStart w:id="43" w:name="ref-meyer2002"/>
+    <w:bookmarkEnd w:id="43"/>
+    <w:bookmarkStart w:id="45" w:name="ref-meyer2002"/>
     <w:p>
       <w:pPr>
         <w:pStyle w:val="Bibliography"/>
@@ -8809,7 +10710,7 @@
         </w:rPr>
         <w:t xml:space="preserve"> </w:t>
       </w:r>
-      <w:hyperlink r:id="rId42">
+      <w:hyperlink r:id="rId44">
         <w:r>
           <w:rPr>
             <w:rStyle w:val="Hyperlink"/>
@@ -8824,8 +10725,8 @@
         <w:t xml:space="preserve">.</w:t>
       </w:r>
     </w:p>
-    <w:bookmarkEnd w:id="43"/>
-    <w:bookmarkStart w:id="44" w:name="ref-monteverde2026formulation"/>
+    <w:bookmarkEnd w:id="45"/>
+    <w:bookmarkStart w:id="46" w:name="ref-monteverde2026formulation"/>
     <w:p>
       <w:pPr>
         <w:pStyle w:val="Bibliography"/>
@@ -8849,8 +10750,8 @@
         <w:t xml:space="preserve">“Quantum Gates and Algorithms in Qg Units: Hamming-Weight Conservation, Readout Classes and the Local Radius.”</w:t>
       </w:r>
     </w:p>
-    <w:bookmarkEnd w:id="44"/>
-    <w:bookmarkStart w:id="46" w:name="ref-monteverde2026qang"/>
+    <w:bookmarkEnd w:id="46"/>
+    <w:bookmarkStart w:id="48" w:name="ref-monteverde2026qang"/>
     <w:p>
       <w:pPr>
         <w:pStyle w:val="Bibliography"/>
@@ -8903,7 +10804,7 @@
         </w:rPr>
         <w:t xml:space="preserve"> </w:t>
       </w:r>
-      <w:hyperlink r:id="rId45">
+      <w:hyperlink r:id="rId47">
         <w:r>
           <w:rPr>
             <w:rStyle w:val="Hyperlink"/>
@@ -8918,8 +10819,8 @@
         <w:t xml:space="preserve">.</w:t>
       </w:r>
     </w:p>
-    <w:bookmarkEnd w:id="46"/>
-    <w:bookmarkStart w:id="48" w:name="ref-monteverde2026witness"/>
+    <w:bookmarkEnd w:id="48"/>
+    <w:bookmarkStart w:id="50" w:name="ref-monteverde2026witness"/>
     <w:p>
       <w:pPr>
         <w:pStyle w:val="Bibliography"/>
@@ -8968,7 +10869,7 @@
         </w:rPr>
         <w:t xml:space="preserve"> </w:t>
       </w:r>
-      <w:hyperlink r:id="rId47">
+      <w:hyperlink r:id="rId49">
         <w:r>
           <w:rPr>
             <w:rStyle w:val="Hyperlink"/>
@@ -8983,8 +10884,8 @@
         <w:t xml:space="preserve">.</w:t>
       </w:r>
     </w:p>
-    <w:bookmarkEnd w:id="48"/>
-    <w:bookmarkStart w:id="49" w:name="ref-monteverde2026qml"/>
+    <w:bookmarkEnd w:id="50"/>
+    <w:bookmarkStart w:id="51" w:name="ref-monteverde2026qml"/>
     <w:p>
       <w:pPr>
         <w:pStyle w:val="Bibliography"/>
@@ -9026,8 +10927,8 @@
         <w:t xml:space="preserve">-Limited Hardware: What the Qg Symmetry Filter Does and Does Not Do.”</w:t>
       </w:r>
     </w:p>
-    <w:bookmarkEnd w:id="49"/>
-    <w:bookmarkStart w:id="51" w:name="ref-wootters1998"/>
+    <w:bookmarkEnd w:id="51"/>
+    <w:bookmarkStart w:id="53" w:name="ref-wootters1998"/>
     <w:p>
       <w:pPr>
         <w:pStyle w:val="Bibliography"/>
@@ -9082,7 +10983,7 @@
         </w:rPr>
         <w:t xml:space="preserve"> </w:t>
       </w:r>
-      <w:hyperlink r:id="rId50">
+      <w:hyperlink r:id="rId52">
         <w:r>
           <w:rPr>
             <w:rStyle w:val="Hyperlink"/>
@@ -9097,9 +10998,9 @@
         <w:t xml:space="preserve">.</w:t>
       </w:r>
     </w:p>
-    <w:bookmarkEnd w:id="51"/>
-    <w:bookmarkEnd w:id="52"/>
     <w:bookmarkEnd w:id="53"/>
+    <w:bookmarkEnd w:id="54"/>
+    <w:bookmarkEnd w:id="55"/>
     <w:sectPr/>
   </w:body>
 </w:document>

</xml_diff>

<commit_message>
qang 0.6.9: §104 in the radius note (IonQ native gate set), CHANGELOG, Zenodo metadata
</commit_message>
<xml_diff>
--- a/manuscript/qang_radio_es.docx
+++ b/manuscript/qang_radio_es.docx
@@ -4294,7 +4294,7 @@
         <w:rPr>
           <w:rFonts w:ascii="Times New Roman" w:hAnsi="Times New Roman"/>
         </w:rPr>
-        <w:t xml:space="preserve">diecinueve</w:t>
+        <w:t xml:space="preserve">veintitrés</w:t>
       </w:r>
       <w:r>
         <w:rPr>
@@ -4475,7 +4475,7 @@
         <w:rPr>
           <w:rFonts w:ascii="Times New Roman" w:hAnsi="Times New Roman"/>
         </w:rPr>
-        <w:t xml:space="preserve">0.6.8,</w:t>
+        <w:t xml:space="preserve">0.6.9,</w:t>
       </w:r>
       <w:r>
         <w:rPr>
@@ -7747,19 +7747,55 @@
         <w:rPr>
           <w:rFonts w:ascii="Times New Roman" w:hAnsi="Times New Roman"/>
         </w:rPr>
-        <w:t xml:space="preserve">, su compilador puede simplificar circuitos que contienen identidades, así</w:t>
-      </w:r>
-      <w:r>
-        <w:rPr>
-          <w:rFonts w:ascii="Times New Roman" w:hAnsi="Times New Roman"/>
-        </w:rPr>
-        <w:t xml:space="preserve"> </w:t>
-      </w:r>
-      <w:r>
-        <w:rPr>
-          <w:rFonts w:ascii="Times New Roman" w:hAnsi="Times New Roman"/>
-        </w:rPr>
-        <w:t xml:space="preserve">que las filas de eco de IonQ pueden subestimar el ruido (igual muestran un déficit falso de 0.62–0.71).</w:t>
+        <w:t xml:space="preserve">, su compilador puede simplificar circuitos que contienen</w:t>
+      </w:r>
+      <w:r>
+        <w:rPr>
+          <w:rFonts w:ascii="Times New Roman" w:hAnsi="Times New Roman"/>
+        </w:rPr>
+        <w:t xml:space="preserve"> </w:t>
+      </w:r>
+      <w:r>
+        <w:rPr>
+          <w:rFonts w:ascii="Times New Roman" w:hAnsi="Times New Roman"/>
+        </w:rPr>
+        <w:t xml:space="preserve">identidades. Una nueva corrida en el conjunto nativo, con sus propias predicciones (§104), dio el mismo cuadro: entre</w:t>
+      </w:r>
+      <w:r>
+        <w:rPr>
+          <w:rFonts w:ascii="Times New Roman" w:hAnsi="Times New Roman"/>
+        </w:rPr>
+        <w:t xml:space="preserve"> </w:t>
+      </w:r>
+      <w:r>
+        <w:rPr>
+          <w:rFonts w:ascii="Times New Roman" w:hAnsi="Times New Roman"/>
+        </w:rPr>
+        <w:t xml:space="preserve">3.2 y 3.3 veces menos error del déficit con el filtro en circuitos entrenados, y un déficit falso en estados producto de</w:t>
+      </w:r>
+      <w:r>
+        <w:rPr>
+          <w:rFonts w:ascii="Times New Roman" w:hAnsi="Times New Roman"/>
+        </w:rPr>
+        <w:t xml:space="preserve"> </w:t>
+      </w:r>
+      <w:r>
+        <w:rPr>
+          <w:rFonts w:ascii="Times New Roman" w:hAnsi="Times New Roman"/>
+        </w:rPr>
+        <w:t xml:space="preserve">0.74 (aria-1) y 0.71 (forte-1) sin filtro, del que el filtro quitó el 17 %; las filas de eco con el conjunto estándar</w:t>
+      </w:r>
+      <w:r>
+        <w:rPr>
+          <w:rFonts w:ascii="Times New Roman" w:hAnsi="Times New Roman"/>
+        </w:rPr>
+        <w:t xml:space="preserve"> </w:t>
+      </w:r>
+      <w:r>
+        <w:rPr>
+          <w:rFonts w:ascii="Times New Roman" w:hAnsi="Times New Roman"/>
+        </w:rPr>
+        <w:t xml:space="preserve">habían subestimado el ruido solo en aria-1.</w:t>
       </w:r>
     </w:p>
     <w:bookmarkStart w:id="30" w:name="tab:dev"/>
@@ -9967,7 +10003,7 @@
         <w:rPr>
           <w:rFonts w:ascii="Times New Roman" w:hAnsi="Times New Roman"/>
         </w:rPr>
-        <w:t xml:space="preserve">0.6.8 (MIT,</w:t>
+        <w:t xml:space="preserve">0.6.9 (MIT,</w:t>
       </w:r>
       <w:r>
         <w:rPr>

</xml_diff>

<commit_message>
qang 0.6.11: echo calibration of in-sector errors in qang.sectors (echo_transfer_matrix, unmix_sector), radius note with the calibration section, README, CHANGELOG, test count 1251
</commit_message>
<xml_diff>
--- a/manuscript/qang_radio_es.docx
+++ b/manuscript/qang_radio_es.docx
@@ -4270,6 +4270,558 @@
         <w:rPr>
           <w:rFonts w:ascii="Times New Roman" w:hAnsi="Times New Roman"/>
         </w:rPr>
+        <w:t xml:space="preserve">Cinco</w:t>
+      </w:r>
+      <w:r>
+        <w:rPr>
+          <w:rFonts w:ascii="Times New Roman" w:hAnsi="Times New Roman"/>
+        </w:rPr>
+        <w:t xml:space="preserve"> </w:t>
+      </w:r>
+      <w:r>
+        <w:rPr>
+          <w:rFonts w:ascii="Times New Roman" w:hAnsi="Times New Roman"/>
+        </w:rPr>
+        <w:t xml:space="preserve">circuitos</w:t>
+      </w:r>
+      <w:r>
+        <w:rPr>
+          <w:rFonts w:ascii="Times New Roman" w:hAnsi="Times New Roman"/>
+        </w:rPr>
+        <w:t xml:space="preserve"> </w:t>
+      </w:r>
+      <w:r>
+        <w:rPr>
+          <w:rFonts w:ascii="Times New Roman" w:hAnsi="Times New Roman"/>
+        </w:rPr>
+        <w:t xml:space="preserve">de</w:t>
+      </w:r>
+      <w:r>
+        <w:rPr>
+          <w:rFonts w:ascii="Times New Roman" w:hAnsi="Times New Roman"/>
+        </w:rPr>
+        <w:t xml:space="preserve"> </w:t>
+      </w:r>
+      <w:r>
+        <w:rPr>
+          <w:rFonts w:ascii="Times New Roman" w:hAnsi="Times New Roman"/>
+        </w:rPr>
+        <w:t xml:space="preserve">eco</w:t>
+      </w:r>
+      <w:r>
+        <w:rPr>
+          <w:rFonts w:ascii="Times New Roman" w:hAnsi="Times New Roman"/>
+        </w:rPr>
+        <w:t xml:space="preserve"> </w:t>
+      </w:r>
+      <w:r>
+        <w:rPr>
+          <w:rFonts w:ascii="Times New Roman" w:hAnsi="Times New Roman"/>
+        </w:rPr>
+        <w:t xml:space="preserve">miden</w:t>
+      </w:r>
+      <w:r>
+        <w:rPr>
+          <w:rFonts w:ascii="Times New Roman" w:hAnsi="Times New Roman"/>
+        </w:rPr>
+        <w:t xml:space="preserve"> </w:t>
+      </w:r>
+      <w:r>
+        <w:rPr>
+          <w:rFonts w:ascii="Times New Roman" w:hAnsi="Times New Roman"/>
+        </w:rPr>
+        <w:t xml:space="preserve">los</w:t>
+      </w:r>
+      <w:r>
+        <w:rPr>
+          <w:rFonts w:ascii="Times New Roman" w:hAnsi="Times New Roman"/>
+        </w:rPr>
+        <w:t xml:space="preserve"> </w:t>
+      </w:r>
+      <w:r>
+        <w:rPr>
+          <w:rFonts w:ascii="Times New Roman" w:hAnsi="Times New Roman"/>
+        </w:rPr>
+        <w:t xml:space="preserve">errores</w:t>
+      </w:r>
+      <w:r>
+        <w:rPr>
+          <w:rFonts w:ascii="Times New Roman" w:hAnsi="Times New Roman"/>
+        </w:rPr>
+        <w:t xml:space="preserve"> </w:t>
+      </w:r>
+      <w:r>
+        <w:rPr>
+          <w:rFonts w:ascii="Times New Roman" w:hAnsi="Times New Roman"/>
+        </w:rPr>
+        <w:t xml:space="preserve">dentro</w:t>
+      </w:r>
+      <w:r>
+        <w:rPr>
+          <w:rFonts w:ascii="Times New Roman" w:hAnsi="Times New Roman"/>
+        </w:rPr>
+        <w:t xml:space="preserve"> </w:t>
+      </w:r>
+      <w:r>
+        <w:rPr>
+          <w:rFonts w:ascii="Times New Roman" w:hAnsi="Times New Roman"/>
+        </w:rPr>
+        <w:t xml:space="preserve">del</w:t>
+      </w:r>
+      <w:r>
+        <w:rPr>
+          <w:rFonts w:ascii="Times New Roman" w:hAnsi="Times New Roman"/>
+        </w:rPr>
+        <w:t xml:space="preserve"> </w:t>
+      </w:r>
+      <w:r>
+        <w:rPr>
+          <w:rFonts w:ascii="Times New Roman" w:hAnsi="Times New Roman"/>
+        </w:rPr>
+        <w:t xml:space="preserve">sector,</w:t>
+      </w:r>
+      <w:r>
+        <w:rPr>
+          <w:rFonts w:ascii="Times New Roman" w:hAnsi="Times New Roman"/>
+        </w:rPr>
+        <w:t xml:space="preserve"> </w:t>
+      </w:r>
+      <w:r>
+        <w:rPr>
+          <w:rFonts w:ascii="Times New Roman" w:hAnsi="Times New Roman"/>
+        </w:rPr>
+        <w:t xml:space="preserve">e</w:t>
+      </w:r>
+      <w:r>
+        <w:rPr>
+          <w:rFonts w:ascii="Times New Roman" w:hAnsi="Times New Roman"/>
+        </w:rPr>
+        <w:t xml:space="preserve"> </w:t>
+      </w:r>
+      <w:r>
+        <w:rPr>
+          <w:rFonts w:ascii="Times New Roman" w:hAnsi="Times New Roman"/>
+        </w:rPr>
+        <w:t xml:space="preserve">invertir</w:t>
+      </w:r>
+      <w:r>
+        <w:rPr>
+          <w:rFonts w:ascii="Times New Roman" w:hAnsi="Times New Roman"/>
+        </w:rPr>
+        <w:t xml:space="preserve"> </w:t>
+      </w:r>
+      <w:r>
+        <w:rPr>
+          <w:rFonts w:ascii="Times New Roman" w:hAnsi="Times New Roman"/>
+        </w:rPr>
+        <w:t xml:space="preserve">su</w:t>
+      </w:r>
+      <w:r>
+        <w:rPr>
+          <w:rFonts w:ascii="Times New Roman" w:hAnsi="Times New Roman"/>
+        </w:rPr>
+        <w:t xml:space="preserve"> </w:t>
+      </w:r>
+      <w:r>
+        <w:rPr>
+          <w:rFonts w:ascii="Times New Roman" w:hAnsi="Times New Roman"/>
+        </w:rPr>
+        <w:t xml:space="preserve">matriz</w:t>
+      </w:r>
+      <w:r>
+        <w:rPr>
+          <w:rFonts w:ascii="Times New Roman" w:hAnsi="Times New Roman"/>
+        </w:rPr>
+        <w:t xml:space="preserve"> </w:t>
+      </w:r>
+      <w:r>
+        <w:rPr>
+          <w:rFonts w:ascii="Times New Roman" w:hAnsi="Times New Roman"/>
+        </w:rPr>
+        <w:t xml:space="preserve">de</w:t>
+      </w:r>
+      <w:r>
+        <w:rPr>
+          <w:rFonts w:ascii="Times New Roman" w:hAnsi="Times New Roman"/>
+        </w:rPr>
+        <w:t xml:space="preserve"> </w:t>
+      </w:r>
+      <w:r>
+        <w:rPr>
+          <w:rFonts w:ascii="Times New Roman" w:hAnsi="Times New Roman"/>
+        </w:rPr>
+        <w:t xml:space="preserve">transferencia</w:t>
+      </w:r>
+      <w:r>
+        <w:rPr>
+          <w:rFonts w:ascii="Times New Roman" w:hAnsi="Times New Roman"/>
+        </w:rPr>
+        <w:t xml:space="preserve"> </w:t>
+      </w:r>
+      <w:r>
+        <w:rPr>
+          <w:rFonts w:ascii="Times New Roman" w:hAnsi="Times New Roman"/>
+        </w:rPr>
+        <w:t xml:space="preserve">quita</w:t>
+      </w:r>
+      <w:r>
+        <w:rPr>
+          <w:rFonts w:ascii="Times New Roman" w:hAnsi="Times New Roman"/>
+        </w:rPr>
+        <w:t xml:space="preserve"> </w:t>
+      </w:r>
+      <w:r>
+        <w:rPr>
+          <w:rFonts w:ascii="Times New Roman" w:hAnsi="Times New Roman"/>
+        </w:rPr>
+        <w:t xml:space="preserve">entre</w:t>
+      </w:r>
+      <w:r>
+        <w:rPr>
+          <w:rFonts w:ascii="Times New Roman" w:hAnsi="Times New Roman"/>
+        </w:rPr>
+        <w:t xml:space="preserve"> </w:t>
+      </w:r>
+      <w:r>
+        <w:rPr>
+          <w:rFonts w:ascii="Times New Roman" w:hAnsi="Times New Roman"/>
+        </w:rPr>
+        <w:t xml:space="preserve">el</w:t>
+      </w:r>
+      <w:r>
+        <w:rPr>
+          <w:rFonts w:ascii="Times New Roman" w:hAnsi="Times New Roman"/>
+        </w:rPr>
+        <w:t xml:space="preserve"> </w:t>
+      </w:r>
+      <w:r>
+        <w:rPr>
+          <w:rFonts w:ascii="Times New Roman" w:hAnsi="Times New Roman"/>
+        </w:rPr>
+        <w:t xml:space="preserve">38</w:t>
+      </w:r>
+      <w:r>
+        <w:rPr>
+          <w:rFonts w:ascii="Times New Roman" w:hAnsi="Times New Roman"/>
+        </w:rPr>
+        <w:t xml:space="preserve"> </w:t>
+      </w:r>
+      <w:r>
+        <w:rPr>
+          <w:rFonts w:ascii="Times New Roman" w:hAnsi="Times New Roman"/>
+        </w:rPr>
+        <w:t xml:space="preserve">y</w:t>
+      </w:r>
+      <w:r>
+        <w:rPr>
+          <w:rFonts w:ascii="Times New Roman" w:hAnsi="Times New Roman"/>
+        </w:rPr>
+        <w:t xml:space="preserve"> </w:t>
+      </w:r>
+      <w:r>
+        <w:rPr>
+          <w:rFonts w:ascii="Times New Roman" w:hAnsi="Times New Roman"/>
+        </w:rPr>
+        <w:t xml:space="preserve">el</w:t>
+      </w:r>
+      <w:r>
+        <w:rPr>
+          <w:rFonts w:ascii="Times New Roman" w:hAnsi="Times New Roman"/>
+        </w:rPr>
+        <w:t xml:space="preserve"> </w:t>
+      </w:r>
+      <w:r>
+        <w:rPr>
+          <w:rFonts w:ascii="Times New Roman" w:hAnsi="Times New Roman"/>
+        </w:rPr>
+        <w:t xml:space="preserve">47 %</w:t>
+      </w:r>
+      <w:r>
+        <w:rPr>
+          <w:rFonts w:ascii="Times New Roman" w:hAnsi="Times New Roman"/>
+        </w:rPr>
+        <w:t xml:space="preserve"> </w:t>
+      </w:r>
+      <w:r>
+        <w:rPr>
+          <w:rFonts w:ascii="Times New Roman" w:hAnsi="Times New Roman"/>
+        </w:rPr>
+        <w:t xml:space="preserve">de</w:t>
+      </w:r>
+      <w:r>
+        <w:rPr>
+          <w:rFonts w:ascii="Times New Roman" w:hAnsi="Times New Roman"/>
+        </w:rPr>
+        <w:t xml:space="preserve"> </w:t>
+      </w:r>
+      <w:r>
+        <w:rPr>
+          <w:rFonts w:ascii="Times New Roman" w:hAnsi="Times New Roman"/>
+        </w:rPr>
+        <w:t xml:space="preserve">lo</w:t>
+      </w:r>
+      <w:r>
+        <w:rPr>
+          <w:rFonts w:ascii="Times New Roman" w:hAnsi="Times New Roman"/>
+        </w:rPr>
+        <w:t xml:space="preserve"> </w:t>
+      </w:r>
+      <w:r>
+        <w:rPr>
+          <w:rFonts w:ascii="Times New Roman" w:hAnsi="Times New Roman"/>
+        </w:rPr>
+        <w:t xml:space="preserve">que</w:t>
+      </w:r>
+      <w:r>
+        <w:rPr>
+          <w:rFonts w:ascii="Times New Roman" w:hAnsi="Times New Roman"/>
+        </w:rPr>
+        <w:t xml:space="preserve"> </w:t>
+      </w:r>
+      <w:r>
+        <w:rPr>
+          <w:rFonts w:ascii="Times New Roman" w:hAnsi="Times New Roman"/>
+        </w:rPr>
+        <w:t xml:space="preserve">deja</w:t>
+      </w:r>
+      <w:r>
+        <w:rPr>
+          <w:rFonts w:ascii="Times New Roman" w:hAnsi="Times New Roman"/>
+        </w:rPr>
+        <w:t xml:space="preserve"> </w:t>
+      </w:r>
+      <w:r>
+        <w:rPr>
+          <w:rFonts w:ascii="Times New Roman" w:hAnsi="Times New Roman"/>
+        </w:rPr>
+        <w:t xml:space="preserve">el</w:t>
+      </w:r>
+      <w:r>
+        <w:rPr>
+          <w:rFonts w:ascii="Times New Roman" w:hAnsi="Times New Roman"/>
+        </w:rPr>
+        <w:t xml:space="preserve"> </w:t>
+      </w:r>
+      <w:r>
+        <w:rPr>
+          <w:rFonts w:ascii="Times New Roman" w:hAnsi="Times New Roman"/>
+        </w:rPr>
+        <w:t xml:space="preserve">filtro:</w:t>
+      </w:r>
+      <w:r>
+        <w:rPr>
+          <w:rFonts w:ascii="Times New Roman" w:hAnsi="Times New Roman"/>
+        </w:rPr>
+        <w:t xml:space="preserve"> </w:t>
+      </w:r>
+      <w:r>
+        <w:rPr>
+          <w:rFonts w:ascii="Times New Roman" w:hAnsi="Times New Roman"/>
+        </w:rPr>
+        <w:t xml:space="preserve">el</w:t>
+      </w:r>
+      <w:r>
+        <w:rPr>
+          <w:rFonts w:ascii="Times New Roman" w:hAnsi="Times New Roman"/>
+        </w:rPr>
+        <w:t xml:space="preserve"> </w:t>
+      </w:r>
+      <w:r>
+        <w:rPr>
+          <w:rFonts w:ascii="Times New Roman" w:hAnsi="Times New Roman"/>
+        </w:rPr>
+        <w:t xml:space="preserve">filtro</w:t>
+      </w:r>
+      <w:r>
+        <w:rPr>
+          <w:rFonts w:ascii="Times New Roman" w:hAnsi="Times New Roman"/>
+        </w:rPr>
+        <w:t xml:space="preserve"> </w:t>
+      </w:r>
+      <w:r>
+        <w:rPr>
+          <w:rFonts w:ascii="Times New Roman" w:hAnsi="Times New Roman"/>
+        </w:rPr>
+        <w:t xml:space="preserve">más</w:t>
+      </w:r>
+      <w:r>
+        <w:rPr>
+          <w:rFonts w:ascii="Times New Roman" w:hAnsi="Times New Roman"/>
+        </w:rPr>
+        <w:t xml:space="preserve"> </w:t>
+      </w:r>
+      <w:r>
+        <w:rPr>
+          <w:rFonts w:ascii="Times New Roman" w:hAnsi="Times New Roman"/>
+        </w:rPr>
+        <w:t xml:space="preserve">la</w:t>
+      </w:r>
+      <w:r>
+        <w:rPr>
+          <w:rFonts w:ascii="Times New Roman" w:hAnsi="Times New Roman"/>
+        </w:rPr>
+        <w:t xml:space="preserve"> </w:t>
+      </w:r>
+      <w:r>
+        <w:rPr>
+          <w:rFonts w:ascii="Times New Roman" w:hAnsi="Times New Roman"/>
+        </w:rPr>
+        <w:t xml:space="preserve">calibración</w:t>
+      </w:r>
+      <w:r>
+        <w:rPr>
+          <w:rFonts w:ascii="Times New Roman" w:hAnsi="Times New Roman"/>
+        </w:rPr>
+        <w:t xml:space="preserve"> </w:t>
+      </w:r>
+      <w:r>
+        <w:rPr>
+          <w:rFonts w:ascii="Times New Roman" w:hAnsi="Times New Roman"/>
+        </w:rPr>
+        <w:t xml:space="preserve">es</w:t>
+      </w:r>
+      <w:r>
+        <w:rPr>
+          <w:rFonts w:ascii="Times New Roman" w:hAnsi="Times New Roman"/>
+        </w:rPr>
+        <w:t xml:space="preserve"> </w:t>
+      </w:r>
+      <w:r>
+        <w:rPr>
+          <w:rFonts w:ascii="Times New Roman" w:hAnsi="Times New Roman"/>
+        </w:rPr>
+        <w:t xml:space="preserve">entre</w:t>
+      </w:r>
+      <w:r>
+        <w:rPr>
+          <w:rFonts w:ascii="Times New Roman" w:hAnsi="Times New Roman"/>
+        </w:rPr>
+        <w:t xml:space="preserve"> </w:t>
+      </w:r>
+      <w:r>
+        <w:rPr>
+          <w:rFonts w:ascii="Times New Roman" w:hAnsi="Times New Roman"/>
+        </w:rPr>
+        <w:t xml:space="preserve">6</w:t>
+      </w:r>
+      <w:r>
+        <w:rPr>
+          <w:rFonts w:ascii="Times New Roman" w:hAnsi="Times New Roman"/>
+        </w:rPr>
+        <w:t xml:space="preserve"> </w:t>
+      </w:r>
+      <w:r>
+        <w:rPr>
+          <w:rFonts w:ascii="Times New Roman" w:hAnsi="Times New Roman"/>
+        </w:rPr>
+        <w:t xml:space="preserve">y</w:t>
+      </w:r>
+      <w:r>
+        <w:rPr>
+          <w:rFonts w:ascii="Times New Roman" w:hAnsi="Times New Roman"/>
+        </w:rPr>
+        <w:t xml:space="preserve"> </w:t>
+      </w:r>
+      <w:r>
+        <w:rPr>
+          <w:rFonts w:ascii="Times New Roman" w:hAnsi="Times New Roman"/>
+        </w:rPr>
+        <w:t xml:space="preserve">7</w:t>
+      </w:r>
+      <w:r>
+        <w:rPr>
+          <w:rFonts w:ascii="Times New Roman" w:hAnsi="Times New Roman"/>
+        </w:rPr>
+        <w:t xml:space="preserve"> </w:t>
+      </w:r>
+      <w:r>
+        <w:rPr>
+          <w:rFonts w:ascii="Times New Roman" w:hAnsi="Times New Roman"/>
+        </w:rPr>
+        <w:t xml:space="preserve">veces</w:t>
+      </w:r>
+      <w:r>
+        <w:rPr>
+          <w:rFonts w:ascii="Times New Roman" w:hAnsi="Times New Roman"/>
+        </w:rPr>
+        <w:t xml:space="preserve"> </w:t>
+      </w:r>
+      <w:r>
+        <w:rPr>
+          <w:rFonts w:ascii="Times New Roman" w:hAnsi="Times New Roman"/>
+        </w:rPr>
+        <w:t xml:space="preserve">más</w:t>
+      </w:r>
+      <w:r>
+        <w:rPr>
+          <w:rFonts w:ascii="Times New Roman" w:hAnsi="Times New Roman"/>
+        </w:rPr>
+        <w:t xml:space="preserve"> </w:t>
+      </w:r>
+      <w:r>
+        <w:rPr>
+          <w:rFonts w:ascii="Times New Roman" w:hAnsi="Times New Roman"/>
+        </w:rPr>
+        <w:t xml:space="preserve">preciso</w:t>
+      </w:r>
+      <w:r>
+        <w:rPr>
+          <w:rFonts w:ascii="Times New Roman" w:hAnsi="Times New Roman"/>
+        </w:rPr>
+        <w:t xml:space="preserve"> </w:t>
+      </w:r>
+      <w:r>
+        <w:rPr>
+          <w:rFonts w:ascii="Times New Roman" w:hAnsi="Times New Roman"/>
+        </w:rPr>
+        <w:t xml:space="preserve">que</w:t>
+      </w:r>
+      <w:r>
+        <w:rPr>
+          <w:rFonts w:ascii="Times New Roman" w:hAnsi="Times New Roman"/>
+        </w:rPr>
+        <w:t xml:space="preserve"> </w:t>
+      </w:r>
+      <w:r>
+        <w:rPr>
+          <w:rFonts w:ascii="Times New Roman" w:hAnsi="Times New Roman"/>
+        </w:rPr>
+        <w:t xml:space="preserve">la</w:t>
+      </w:r>
+      <w:r>
+        <w:rPr>
+          <w:rFonts w:ascii="Times New Roman" w:hAnsi="Times New Roman"/>
+        </w:rPr>
+        <w:t xml:space="preserve"> </w:t>
+      </w:r>
+      <w:r>
+        <w:rPr>
+          <w:rFonts w:ascii="Times New Roman" w:hAnsi="Times New Roman"/>
+        </w:rPr>
+        <w:t xml:space="preserve">lectura</w:t>
+      </w:r>
+      <w:r>
+        <w:rPr>
+          <w:rFonts w:ascii="Times New Roman" w:hAnsi="Times New Roman"/>
+        </w:rPr>
+        <w:t xml:space="preserve"> </w:t>
+      </w:r>
+      <w:r>
+        <w:rPr>
+          <w:rFonts w:ascii="Times New Roman" w:hAnsi="Times New Roman"/>
+        </w:rPr>
+        <w:t xml:space="preserve">cruda.</w:t>
+      </w:r>
+      <w:r>
+        <w:rPr>
+          <w:rFonts w:ascii="Times New Roman" w:hAnsi="Times New Roman"/>
+        </w:rPr>
+        <w:t xml:space="preserve"> </w:t>
+      </w:r>
+      <w:r>
+        <w:rPr>
+          <w:rFonts w:ascii="Times New Roman" w:hAnsi="Times New Roman"/>
+        </w:rPr>
         <w:t xml:space="preserve">Tres</w:t>
       </w:r>
       <w:r>
@@ -4294,7 +4846,7 @@
         <w:rPr>
           <w:rFonts w:ascii="Times New Roman" w:hAnsi="Times New Roman"/>
         </w:rPr>
-        <w:t xml:space="preserve">veintitrés</w:t>
+        <w:t xml:space="preserve">veintisiete</w:t>
       </w:r>
       <w:r>
         <w:rPr>
@@ -4475,7 +5027,7 @@
         <w:rPr>
           <w:rFonts w:ascii="Times New Roman" w:hAnsi="Times New Roman"/>
         </w:rPr>
-        <w:t xml:space="preserve">0.6.9,</w:t>
+        <w:t xml:space="preserve">0.6.11,</w:t>
       </w:r>
       <w:r>
         <w:rPr>
@@ -7740,7 +8292,7 @@
           <w:rPr>
             <w:rStyle w:val="Hyperlink"/>
           </w:rPr>
-          <w:t xml:space="preserve">6</w:t>
+          <w:t xml:space="preserve">7</w:t>
         </w:r>
       </w:hyperlink>
       <w:r>
@@ -8459,7 +9011,883 @@
       </w:r>
     </w:p>
     <w:bookmarkEnd w:id="31"/>
-    <w:bookmarkStart w:id="33" w:name="sec:angle"/>
+    <w:bookmarkStart w:id="33" w:name="calibrar-los-errores-dentro-del-sector"/>
+    <w:p>
+      <w:pPr>
+        <w:pStyle w:val="Heading1"/>
+      </w:pPr>
+      <w:r>
+        <w:rPr>
+          <w:rFonts w:ascii="Times New Roman" w:hAnsi="Times New Roman"/>
+        </w:rPr>
+        <w:t xml:space="preserve">Calibrar los errores dentro del sector</w:t>
+      </w:r>
+    </w:p>
+    <w:p>
+      <w:pPr>
+        <w:pStyle w:val="FirstParagraph"/>
+      </w:pPr>
+      <w:r>
+        <w:rPr>
+          <w:rFonts w:ascii="Times New Roman" w:hAnsi="Times New Roman"/>
+        </w:rPr>
+        <w:t xml:space="preserve">Los errores que pasan el filtro se pueden medir. Un circuito de eco que prepara el estado del sector</w:t>
+      </w:r>
+      <w:r>
+        <w:rPr>
+          <w:rFonts w:ascii="Times New Roman" w:hAnsi="Times New Roman"/>
+        </w:rPr>
+        <w:t xml:space="preserve"> </w:t>
+      </w:r>
+      <m:oMath>
+        <m:r>
+          <m:rPr>
+            <m:sty m:val="p"/>
+          </m:rPr>
+          <m:t>|</m:t>
+        </m:r>
+        <m:sSub>
+          <m:e>
+            <m:r>
+              <m:t>e</m:t>
+            </m:r>
+          </m:e>
+          <m:sub>
+            <m:r>
+              <m:t>j</m:t>
+            </m:r>
+          </m:sub>
+        </m:sSub>
+        <m:r>
+          <m:rPr>
+            <m:sty m:val="p"/>
+          </m:rPr>
+          <m:t>⟩</m:t>
+        </m:r>
+      </m:oMath>
+      <w:r>
+        <w:rPr>
+          <w:rFonts w:ascii="Times New Roman" w:hAnsi="Times New Roman"/>
+        </w:rPr>
+        <w:t xml:space="preserve"> </w:t>
+      </w:r>
+      <w:r>
+        <w:rPr>
+          <w:rFonts w:ascii="Times New Roman" w:hAnsi="Times New Roman"/>
+        </w:rPr>
+        <w:t xml:space="preserve">y</w:t>
+      </w:r>
+      <w:r>
+        <w:rPr>
+          <w:rFonts w:ascii="Times New Roman" w:hAnsi="Times New Roman"/>
+        </w:rPr>
+        <w:t xml:space="preserve"> </w:t>
+      </w:r>
+      <w:r>
+        <w:rPr>
+          <w:rFonts w:ascii="Times New Roman" w:hAnsi="Times New Roman"/>
+        </w:rPr>
+        <w:t xml:space="preserve">ejecuta el circuito y su inverso debería devolver</w:t>
+      </w:r>
+      <w:r>
+        <w:rPr>
+          <w:rFonts w:ascii="Times New Roman" w:hAnsi="Times New Roman"/>
+        </w:rPr>
+        <w:t xml:space="preserve"> </w:t>
+      </w:r>
+      <m:oMath>
+        <m:r>
+          <m:rPr>
+            <m:sty m:val="p"/>
+          </m:rPr>
+          <m:t>|</m:t>
+        </m:r>
+        <m:sSub>
+          <m:e>
+            <m:r>
+              <m:t>e</m:t>
+            </m:r>
+          </m:e>
+          <m:sub>
+            <m:r>
+              <m:t>j</m:t>
+            </m:r>
+          </m:sub>
+        </m:sSub>
+        <m:r>
+          <m:rPr>
+            <m:sty m:val="p"/>
+          </m:rPr>
+          <m:t>⟩</m:t>
+        </m:r>
+      </m:oMath>
+      <w:r>
+        <w:rPr>
+          <w:rFonts w:ascii="Times New Roman" w:hAnsi="Times New Roman"/>
+        </w:rPr>
+        <w:t xml:space="preserve">; su distribución filtrada sobre los estados del sector</w:t>
+      </w:r>
+      <w:r>
+        <w:rPr>
+          <w:rFonts w:ascii="Times New Roman" w:hAnsi="Times New Roman"/>
+        </w:rPr>
+        <w:t xml:space="preserve"> </w:t>
+      </w:r>
+      <w:r>
+        <w:rPr>
+          <w:rFonts w:ascii="Times New Roman" w:hAnsi="Times New Roman"/>
+        </w:rPr>
+        <w:t xml:space="preserve">es la columna</w:t>
+      </w:r>
+      <w:r>
+        <w:rPr>
+          <w:rFonts w:ascii="Times New Roman" w:hAnsi="Times New Roman"/>
+        </w:rPr>
+        <w:t xml:space="preserve"> </w:t>
+      </w:r>
+      <m:oMath>
+        <m:r>
+          <m:t>j</m:t>
+        </m:r>
+      </m:oMath>
+      <w:r>
+        <w:rPr>
+          <w:rFonts w:ascii="Times New Roman" w:hAnsi="Times New Roman"/>
+        </w:rPr>
+        <w:t xml:space="preserve"> </w:t>
+      </w:r>
+      <w:r>
+        <w:rPr>
+          <w:rFonts w:ascii="Times New Roman" w:hAnsi="Times New Roman"/>
+        </w:rPr>
+        <w:t xml:space="preserve">de una matriz de transferencia</w:t>
+      </w:r>
+      <w:r>
+        <w:rPr>
+          <w:rFonts w:ascii="Times New Roman" w:hAnsi="Times New Roman"/>
+        </w:rPr>
+        <w:t xml:space="preserve"> </w:t>
+      </w:r>
+      <m:oMath>
+        <m:r>
+          <m:t>M</m:t>
+        </m:r>
+      </m:oMath>
+      <w:r>
+        <w:rPr>
+          <w:rFonts w:ascii="Times New Roman" w:hAnsi="Times New Roman"/>
+        </w:rPr>
+        <w:t xml:space="preserve">, con</w:t>
+      </w:r>
+      <w:r>
+        <w:rPr>
+          <w:rFonts w:ascii="Times New Roman" w:hAnsi="Times New Roman"/>
+        </w:rPr>
+        <w:t xml:space="preserve"> </w:t>
+      </w:r>
+      <m:oMath>
+        <m:sSub>
+          <m:e>
+            <m:r>
+              <m:t>M</m:t>
+            </m:r>
+          </m:e>
+          <m:sub>
+            <m:r>
+              <m:t>i</m:t>
+            </m:r>
+            <m:r>
+              <m:t>j</m:t>
+            </m:r>
+          </m:sub>
+        </m:sSub>
+        <m:r>
+          <m:rPr>
+            <m:sty m:val="p"/>
+          </m:rPr>
+          <m:t>=</m:t>
+        </m:r>
+        <m:r>
+          <m:t>P</m:t>
+        </m:r>
+        <m:d>
+          <m:dPr>
+            <m:begChr m:val="("/>
+            <m:endChr m:val=")"/>
+            <m:sepChr m:val=""/>
+            <m:grow/>
+          </m:dPr>
+          <m:e>
+            <m:r>
+              <m:rPr>
+                <m:nor/>
+                <m:sty m:val="p"/>
+              </m:rPr>
+              <m:t>se mide </m:t>
+            </m:r>
+            <m:r>
+              <m:t>i</m:t>
+            </m:r>
+            <m:r>
+              <m:rPr>
+                <m:sty m:val="p"/>
+              </m:rPr>
+              <m:t>∣</m:t>
+            </m:r>
+            <m:r>
+              <m:rPr>
+                <m:nor/>
+                <m:sty m:val="p"/>
+              </m:rPr>
+              <m:t>se preparó </m:t>
+            </m:r>
+            <m:r>
+              <m:t>j</m:t>
+            </m:r>
+          </m:e>
+        </m:d>
+      </m:oMath>
+      <w:r>
+        <w:rPr>
+          <w:rFonts w:ascii="Times New Roman" w:hAnsi="Times New Roman"/>
+        </w:rPr>
+        <w:t xml:space="preserve">. El</w:t>
+      </w:r>
+      <w:r>
+        <w:rPr>
+          <w:rFonts w:ascii="Times New Roman" w:hAnsi="Times New Roman"/>
+        </w:rPr>
+        <w:t xml:space="preserve"> </w:t>
+      </w:r>
+      <w:r>
+        <w:rPr>
+          <w:rFonts w:ascii="Times New Roman" w:hAnsi="Times New Roman"/>
+        </w:rPr>
+        <w:t xml:space="preserve">circuito de ida tiene más o menos la mitad de las compuertas del eco, así que modelamos su error dentro del sector con</w:t>
+      </w:r>
+      <w:r>
+        <w:rPr>
+          <w:rFonts w:ascii="Times New Roman" w:hAnsi="Times New Roman"/>
+        </w:rPr>
+        <w:t xml:space="preserve"> </w:t>
+      </w:r>
+      <m:oMath>
+        <m:sSup>
+          <m:e>
+            <m:r>
+              <m:t>M</m:t>
+            </m:r>
+          </m:e>
+          <m:sup>
+            <m:r>
+              <m:t>1</m:t>
+            </m:r>
+            <m:r>
+              <m:rPr>
+                <m:sty m:val="p"/>
+              </m:rPr>
+              <m:t>/</m:t>
+            </m:r>
+            <m:r>
+              <m:t>2</m:t>
+            </m:r>
+          </m:sup>
+        </m:sSup>
+      </m:oMath>
+      <w:r>
+        <w:rPr>
+          <w:rFonts w:ascii="Times New Roman" w:hAnsi="Times New Roman"/>
+        </w:rPr>
+        <w:t xml:space="preserve"> </w:t>
+      </w:r>
+      <w:r>
+        <w:rPr>
+          <w:rFonts w:ascii="Times New Roman" w:hAnsi="Times New Roman"/>
+        </w:rPr>
+        <w:t xml:space="preserve">y lo invertimos sobre la distribución filtrada de cada circuito entrenado (mínimos cuadrados no negativos sobre</w:t>
+      </w:r>
+      <w:r>
+        <w:rPr>
+          <w:rFonts w:ascii="Times New Roman" w:hAnsi="Times New Roman"/>
+        </w:rPr>
+        <w:t xml:space="preserve"> </w:t>
+      </w:r>
+      <w:r>
+        <w:rPr>
+          <w:rFonts w:ascii="Times New Roman" w:hAnsi="Times New Roman"/>
+        </w:rPr>
+        <w:t xml:space="preserve">el símplex), como hace la mitigación de lectura con los errores de bit (</w:t>
+      </w:r>
+      <w:r>
+        <w:rPr>
+          <w:rStyle w:val="VerbatimChar"/>
+          <w:rFonts w:ascii="Times New Roman" w:hAnsi="Times New Roman"/>
+        </w:rPr>
+        <w:t xml:space="preserve">qang.sectors.echo_transfer_matrix</w:t>
+      </w:r>
+      <w:r>
+        <w:rPr>
+          <w:rFonts w:ascii="Times New Roman" w:hAnsi="Times New Roman"/>
+        </w:rPr>
+        <w:t xml:space="preserve">,</w:t>
+      </w:r>
+      <w:r>
+        <w:rPr>
+          <w:rFonts w:ascii="Times New Roman" w:hAnsi="Times New Roman"/>
+        </w:rPr>
+        <w:t xml:space="preserve"> </w:t>
+      </w:r>
+      <w:r>
+        <w:rPr>
+          <w:rStyle w:val="VerbatimChar"/>
+          <w:rFonts w:ascii="Times New Roman" w:hAnsi="Times New Roman"/>
+        </w:rPr>
+        <w:t xml:space="preserve">unmix_sector</w:t>
+      </w:r>
+      <w:r>
+        <w:rPr>
+          <w:rFonts w:ascii="Times New Roman" w:hAnsi="Times New Roman"/>
+        </w:rPr>
+        <w:t xml:space="preserve">). Cuatro predicciones se registraron antes de correr (RESEARCH_NOTES §105); cinco circuitos de</w:t>
+      </w:r>
+      <w:r>
+        <w:rPr>
+          <w:rFonts w:ascii="Times New Roman" w:hAnsi="Times New Roman"/>
+        </w:rPr>
+        <w:t xml:space="preserve"> </w:t>
+      </w:r>
+      <w:r>
+        <w:rPr>
+          <w:rFonts w:ascii="Times New Roman" w:hAnsi="Times New Roman"/>
+        </w:rPr>
+        <w:t xml:space="preserve">eco con 4000 disparos calibran cada backend.</w:t>
+      </w:r>
+    </w:p>
+    <w:bookmarkStart w:id="32" w:name="tab:echo"/>
+    <w:p>
+      <w:pPr>
+        <w:pStyle w:val="TableCaption"/>
+      </w:pPr>
+      <w:r>
+        <w:rPr>
+          <w:rFonts w:ascii="Times New Roman" w:hAnsi="Times New Roman"/>
+          <w:sz w:val="18"/>
+        </w:rPr>
+        <w:t xml:space="preserve">Error absoluto medio del déficit de radio en los 30 circuitos entrenados, con la calibración por eco.</w:t>
+      </w:r>
+    </w:p>
+    <w:tbl>
+      <w:tblPr>
+        <w:tblStyle w:val="Table"/>
+        <w:tblW w:type="auto" w:w="0"/>
+        <w:tblLook w:firstRow="1" w:lastRow="0" w:firstColumn="0" w:lastColumn="0" w:noHBand="0" w:noVBand="0" w:val="0020"/>
+        <w:jc w:val="start"/>
+        <w:tblCaption w:val="Error absoluto medio del déficit de radio en los 30 circuitos entrenados, con la calibración por eco."/>
+      </w:tblPr>
+      <w:tblGrid>
+        <w:gridCol w:w="1584"/>
+        <w:gridCol w:w="1584"/>
+        <w:gridCol w:w="1584"/>
+        <w:gridCol w:w="1584"/>
+        <w:gridCol w:w="1584"/>
+      </w:tblGrid>
+      <w:tr>
+        <w:trPr>
+          <w:tblHeader w:val="true"/>
+        </w:trPr>
+        <w:tc>
+          <w:tcPr/>
+          <w:p>
+            <w:pPr>
+              <w:pStyle w:val="Compact"/>
+              <w:jc w:val="left"/>
+            </w:pPr>
+            <w:r>
+              <w:t xml:space="preserve">backend</w:t>
+            </w:r>
+          </w:p>
+        </w:tc>
+        <w:tc>
+          <w:tcPr/>
+          <w:p>
+            <w:pPr>
+              <w:pStyle w:val="Compact"/>
+              <w:jc w:val="center"/>
+            </w:pPr>
+            <w:r>
+              <w:t xml:space="preserve">sin qang</w:t>
+            </w:r>
+          </w:p>
+        </w:tc>
+        <w:tc>
+          <w:tcPr/>
+          <w:p>
+            <w:pPr>
+              <w:pStyle w:val="Compact"/>
+              <w:jc w:val="center"/>
+            </w:pPr>
+            <w:r>
+              <w:t xml:space="preserve">qang</w:t>
+            </w:r>
+          </w:p>
+        </w:tc>
+        <w:tc>
+          <w:tcPr/>
+          <w:p>
+            <w:pPr>
+              <w:pStyle w:val="Compact"/>
+              <w:jc w:val="center"/>
+            </w:pPr>
+            <w:r>
+              <w:t xml:space="preserve">qang + eco (</w:t>
+            </w:r>
+            <m:oMath>
+              <m:sSup>
+                <m:e>
+                  <m:r>
+                    <m:t>M</m:t>
+                  </m:r>
+                </m:e>
+                <m:sup>
+                  <m:r>
+                    <m:t>1</m:t>
+                  </m:r>
+                  <m:r>
+                    <m:rPr>
+                      <m:sty m:val="p"/>
+                    </m:rPr>
+                    <m:t>/</m:t>
+                  </m:r>
+                  <m:r>
+                    <m:t>2</m:t>
+                  </m:r>
+                </m:sup>
+              </m:sSup>
+            </m:oMath>
+            <w:r>
+              <w:t xml:space="preserve">)</w:t>
+            </w:r>
+          </w:p>
+        </w:tc>
+        <w:tc>
+          <w:tcPr/>
+          <w:p>
+            <w:pPr>
+              <w:pStyle w:val="Compact"/>
+              <w:jc w:val="center"/>
+            </w:pPr>
+            <w:r>
+              <w:t xml:space="preserve">qang + eco (</w:t>
+            </w:r>
+            <m:oMath>
+              <m:r>
+                <m:t>M</m:t>
+              </m:r>
+            </m:oMath>
+            <w:r>
+              <w:t xml:space="preserve">)</w:t>
+            </w:r>
+          </w:p>
+        </w:tc>
+      </w:tr>
+      <w:tr>
+        <w:tc>
+          <w:tcPr/>
+          <w:p>
+            <w:pPr>
+              <w:pStyle w:val="Compact"/>
+              <w:jc w:val="left"/>
+            </w:pPr>
+            <w:r>
+              <w:t xml:space="preserve">IBM brisbane</w:t>
+            </w:r>
+          </w:p>
+        </w:tc>
+        <w:tc>
+          <w:tcPr/>
+          <w:p>
+            <w:pPr>
+              <w:pStyle w:val="Compact"/>
+              <w:jc w:val="center"/>
+            </w:pPr>
+            <w:r>
+              <w:t xml:space="preserve">0.264</w:t>
+            </w:r>
+          </w:p>
+        </w:tc>
+        <w:tc>
+          <w:tcPr/>
+          <w:p>
+            <w:pPr>
+              <w:pStyle w:val="Compact"/>
+              <w:jc w:val="center"/>
+            </w:pPr>
+            <w:r>
+              <w:t xml:space="preserve">0.082</w:t>
+            </w:r>
+          </w:p>
+        </w:tc>
+        <w:tc>
+          <w:tcPr/>
+          <w:p>
+            <w:pPr>
+              <w:pStyle w:val="Compact"/>
+              <w:jc w:val="center"/>
+            </w:pPr>
+            <w:r>
+              <w:t xml:space="preserve">0.043</w:t>
+            </w:r>
+          </w:p>
+        </w:tc>
+        <w:tc>
+          <w:tcPr/>
+          <w:p>
+            <w:pPr>
+              <w:pStyle w:val="Compact"/>
+              <w:jc w:val="center"/>
+            </w:pPr>
+            <w:r>
+              <w:t xml:space="preserve">0.053</w:t>
+            </w:r>
+          </w:p>
+        </w:tc>
+      </w:tr>
+      <w:tr>
+        <w:tc>
+          <w:tcPr/>
+          <w:p>
+            <w:pPr>
+              <w:pStyle w:val="Compact"/>
+              <w:jc w:val="left"/>
+            </w:pPr>
+            <w:r>
+              <w:t xml:space="preserve">IBM sherbrooke</w:t>
+            </w:r>
+          </w:p>
+        </w:tc>
+        <w:tc>
+          <w:tcPr/>
+          <w:p>
+            <w:pPr>
+              <w:pStyle w:val="Compact"/>
+              <w:jc w:val="center"/>
+            </w:pPr>
+            <w:r>
+              <w:t xml:space="preserve">0.231</w:t>
+            </w:r>
+          </w:p>
+        </w:tc>
+        <w:tc>
+          <w:tcPr/>
+          <w:p>
+            <w:pPr>
+              <w:pStyle w:val="Compact"/>
+              <w:jc w:val="center"/>
+            </w:pPr>
+            <w:r>
+              <w:t xml:space="preserve">0.059</w:t>
+            </w:r>
+          </w:p>
+        </w:tc>
+        <w:tc>
+          <w:tcPr/>
+          <w:p>
+            <w:pPr>
+              <w:pStyle w:val="Compact"/>
+              <w:jc w:val="center"/>
+            </w:pPr>
+            <w:r>
+              <w:t xml:space="preserve">0.032</w:t>
+            </w:r>
+          </w:p>
+        </w:tc>
+        <w:tc>
+          <w:tcPr/>
+          <w:p>
+            <w:pPr>
+              <w:pStyle w:val="Compact"/>
+              <w:jc w:val="center"/>
+            </w:pPr>
+            <w:r>
+              <w:t xml:space="preserve">0.038</w:t>
+            </w:r>
+          </w:p>
+        </w:tc>
+      </w:tr>
+      <w:tr>
+        <w:tc>
+          <w:tcPr/>
+          <w:p>
+            <w:pPr>
+              <w:pStyle w:val="Compact"/>
+              <w:jc w:val="left"/>
+            </w:pPr>
+            <w:r>
+              <w:t xml:space="preserve">IBM torino</w:t>
+            </w:r>
+          </w:p>
+        </w:tc>
+        <w:tc>
+          <w:tcPr/>
+          <w:p>
+            <w:pPr>
+              <w:pStyle w:val="Compact"/>
+              <w:jc w:val="center"/>
+            </w:pPr>
+            <w:r>
+              <w:t xml:space="preserve">0.197</w:t>
+            </w:r>
+          </w:p>
+        </w:tc>
+        <w:tc>
+          <w:tcPr/>
+          <w:p>
+            <w:pPr>
+              <w:pStyle w:val="Compact"/>
+              <w:jc w:val="center"/>
+            </w:pPr>
+            <w:r>
+              <w:t xml:space="preserve">0.050</w:t>
+            </w:r>
+          </w:p>
+        </w:tc>
+        <w:tc>
+          <w:tcPr/>
+          <w:p>
+            <w:pPr>
+              <w:pStyle w:val="Compact"/>
+              <w:jc w:val="center"/>
+            </w:pPr>
+            <w:r>
+              <w:t xml:space="preserve">0.031</w:t>
+            </w:r>
+          </w:p>
+        </w:tc>
+        <w:tc>
+          <w:tcPr/>
+          <w:p>
+            <w:pPr>
+              <w:pStyle w:val="Compact"/>
+              <w:jc w:val="center"/>
+            </w:pPr>
+            <w:r>
+              <w:t xml:space="preserve">0.034</w:t>
+            </w:r>
+          </w:p>
+        </w:tc>
+      </w:tr>
+      <w:tr>
+        <w:tc>
+          <w:tcPr/>
+          <w:p>
+            <w:pPr>
+              <w:pStyle w:val="Compact"/>
+              <w:jc w:val="left"/>
+            </w:pPr>
+            <w:r>
+              <w:t xml:space="preserve">IonQ aria-1 (nativo)</w:t>
+            </w:r>
+          </w:p>
+        </w:tc>
+        <w:tc>
+          <w:tcPr/>
+          <w:p>
+            <w:pPr>
+              <w:pStyle w:val="Compact"/>
+              <w:jc w:val="center"/>
+            </w:pPr>
+            <w:r>
+              <w:t xml:space="preserve">0.301</w:t>
+            </w:r>
+          </w:p>
+        </w:tc>
+        <w:tc>
+          <w:tcPr/>
+          <w:p>
+            <w:pPr>
+              <w:pStyle w:val="Compact"/>
+              <w:jc w:val="center"/>
+            </w:pPr>
+            <w:r>
+              <w:t xml:space="preserve">0.090</w:t>
+            </w:r>
+          </w:p>
+        </w:tc>
+        <w:tc>
+          <w:tcPr/>
+          <w:p>
+            <w:pPr>
+              <w:pStyle w:val="Compact"/>
+              <w:jc w:val="center"/>
+            </w:pPr>
+            <w:r>
+              <w:t xml:space="preserve">0.049</w:t>
+            </w:r>
+          </w:p>
+        </w:tc>
+        <w:tc>
+          <w:tcPr/>
+          <w:p>
+            <w:pPr>
+              <w:pStyle w:val="Compact"/>
+              <w:jc w:val="center"/>
+            </w:pPr>
+            <w:r>
+              <w:t xml:space="preserve">0.050</w:t>
+            </w:r>
+          </w:p>
+        </w:tc>
+      </w:tr>
+      <w:tr>
+        <w:tc>
+          <w:tcPr/>
+          <w:p>
+            <w:pPr>
+              <w:pStyle w:val="Compact"/>
+              <w:jc w:val="left"/>
+            </w:pPr>
+            <w:r>
+              <w:t xml:space="preserve">IonQ forte-1 (nativo)</w:t>
+            </w:r>
+          </w:p>
+        </w:tc>
+        <w:tc>
+          <w:tcPr/>
+          <w:p>
+            <w:pPr>
+              <w:pStyle w:val="Compact"/>
+              <w:jc w:val="center"/>
+            </w:pPr>
+            <w:r>
+              <w:t xml:space="preserve">0.285</w:t>
+            </w:r>
+          </w:p>
+        </w:tc>
+        <w:tc>
+          <w:tcPr/>
+          <w:p>
+            <w:pPr>
+              <w:pStyle w:val="Compact"/>
+              <w:jc w:val="center"/>
+            </w:pPr>
+            <w:r>
+              <w:t xml:space="preserve">0.089</w:t>
+            </w:r>
+          </w:p>
+        </w:tc>
+        <w:tc>
+          <w:tcPr/>
+          <w:p>
+            <w:pPr>
+              <w:pStyle w:val="Compact"/>
+              <w:jc w:val="center"/>
+            </w:pPr>
+            <w:r>
+              <w:t xml:space="preserve">0.047</w:t>
+            </w:r>
+          </w:p>
+        </w:tc>
+        <w:tc>
+          <w:tcPr/>
+          <w:p>
+            <w:pPr>
+              <w:pStyle w:val="Compact"/>
+              <w:jc w:val="center"/>
+            </w:pPr>
+            <w:r>
+              <w:t xml:space="preserve">0.039</w:t>
+            </w:r>
+          </w:p>
+        </w:tc>
+      </w:tr>
+    </w:tbl>
+    <w:bookmarkEnd w:id="32"/>
+    <w:p>
+      <w:pPr>
+        <w:pStyle w:val="BodyText"/>
+      </w:pPr>
+      <w:r>
+        <w:rPr>
+          <w:rFonts w:ascii="Times New Roman" w:hAnsi="Times New Roman"/>
+        </w:rPr>
+        <w:t xml:space="preserve">Las cuatro predicciones se cumplieron. La calibración quita entre el 38 y el 47 % del error que deja el filtro, y el</w:t>
+      </w:r>
+      <w:r>
+        <w:rPr>
+          <w:rFonts w:ascii="Times New Roman" w:hAnsi="Times New Roman"/>
+        </w:rPr>
+        <w:t xml:space="preserve"> </w:t>
+      </w:r>
+      <w:r>
+        <w:rPr>
+          <w:rFonts w:ascii="Times New Roman" w:hAnsi="Times New Roman"/>
+        </w:rPr>
+        <w:t xml:space="preserve">filtro más el eco es entre 6 y 7 veces más preciso que la lectura cruda en todos los backends (Tabla </w:t>
+      </w:r>
+      <w:hyperlink w:anchor="tab:echo">
+        <w:r>
+          <w:rPr>
+            <w:rStyle w:val="Hyperlink"/>
+          </w:rPr>
+          <w:t xml:space="preserve">3</w:t>
+        </w:r>
+      </w:hyperlink>
+      <w:r>
+        <w:rPr>
+          <w:rFonts w:ascii="Times New Roman" w:hAnsi="Times New Roman"/>
+        </w:rPr>
+        <w:t xml:space="preserve">).</w:t>
+      </w:r>
+      <w:r>
+        <w:rPr>
+          <w:rFonts w:ascii="Times New Roman" w:hAnsi="Times New Roman"/>
+        </w:rPr>
+        <w:t xml:space="preserve"> </w:t>
+      </w:r>
+      <w:r>
+        <w:rPr>
+          <w:rFonts w:ascii="Times New Roman" w:hAnsi="Times New Roman"/>
+        </w:rPr>
+        <w:t xml:space="preserve">La raíz cuadrada gana a la matriz completa en promedio, pero no en forte-1, donde el error del circuito de ida se parece</w:t>
+      </w:r>
+      <w:r>
+        <w:rPr>
+          <w:rFonts w:ascii="Times New Roman" w:hAnsi="Times New Roman"/>
+        </w:rPr>
+        <w:t xml:space="preserve"> </w:t>
+      </w:r>
+      <w:r>
+        <w:rPr>
+          <w:rFonts w:ascii="Times New Roman" w:hAnsi="Times New Roman"/>
+        </w:rPr>
+        <w:t xml:space="preserve">más al del eco completo. La diagonal de</w:t>
+      </w:r>
+      <w:r>
+        <w:rPr>
+          <w:rFonts w:ascii="Times New Roman" w:hAnsi="Times New Roman"/>
+        </w:rPr>
+        <w:t xml:space="preserve"> </w:t>
+      </w:r>
+      <m:oMath>
+        <m:r>
+          <m:t>M</m:t>
+        </m:r>
+      </m:oMath>
+      <w:r>
+        <w:rPr>
+          <w:rFonts w:ascii="Times New Roman" w:hAnsi="Times New Roman"/>
+        </w:rPr>
+        <w:t xml:space="preserve"> </w:t>
+      </w:r>
+      <w:r>
+        <w:rPr>
+          <w:rFonts w:ascii="Times New Roman" w:hAnsi="Times New Roman"/>
+        </w:rPr>
+        <w:t xml:space="preserve">(0.77–0.92) mide lo que el filtro no puede limpiar.</w:t>
+      </w:r>
+    </w:p>
+    <w:bookmarkEnd w:id="33"/>
+    <w:bookmarkStart w:id="35" w:name="sec:angle"/>
     <w:p>
       <w:pPr>
         <w:pStyle w:val="Heading1"/>
@@ -8952,7 +10380,7 @@
         <w:t xml:space="preserve">seis predicciones).</w:t>
       </w:r>
     </w:p>
-    <w:bookmarkStart w:id="32" w:name="tab:theta"/>
+    <w:bookmarkStart w:id="34" w:name="tab:theta"/>
     <w:p>
       <w:pPr>
         <w:pStyle w:val="TableCaption"/>
@@ -9254,7 +10682,7 @@
         </w:tc>
       </w:tr>
     </w:tbl>
-    <w:bookmarkEnd w:id="32"/>
+    <w:bookmarkEnd w:id="34"/>
     <w:p>
       <w:pPr>
         <w:pStyle w:val="BodyText"/>
@@ -9534,8 +10962,8 @@
         <w:t xml:space="preserve">de compuertas nativo.</w:t>
       </w:r>
     </w:p>
-    <w:bookmarkEnd w:id="33"/>
-    <w:bookmarkStart w:id="36" w:name="discusión"/>
+    <w:bookmarkEnd w:id="35"/>
+    <w:bookmarkStart w:id="38" w:name="discusión"/>
     <w:p>
       <w:pPr>
         <w:pStyle w:val="Heading1"/>
@@ -9633,22 +11061,22 @@
         <w:rPr>
           <w:rFonts w:ascii="Times New Roman" w:hAnsi="Times New Roman"/>
         </w:rPr>
-        <w:t xml:space="preserve">para el filtro, hacen que los estados producto parezcan entrelazados. Un déficit chico necesita una calibración, por</w:t>
-      </w:r>
-      <w:r>
-        <w:rPr>
-          <w:rFonts w:ascii="Times New Roman" w:hAnsi="Times New Roman"/>
-        </w:rPr>
-        <w:t xml:space="preserve"> </w:t>
-      </w:r>
-      <w:r>
-        <w:rPr>
-          <w:rFonts w:ascii="Times New Roman" w:hAnsi="Times New Roman"/>
-        </w:rPr>
-        <w:t xml:space="preserve">ejemplo el circuito de eco usado aquí, o un modelo de error.</w:t>
+        <w:t xml:space="preserve">para el filtro, hacen que los estados producto parezcan entrelazados. Un déficit chico necesita una calibración; la</w:t>
+      </w:r>
+      <w:r>
+        <w:rPr>
+          <w:rFonts w:ascii="Times New Roman" w:hAnsi="Times New Roman"/>
+        </w:rPr>
+        <w:t xml:space="preserve"> </w:t>
+      </w:r>
+      <w:r>
+        <w:rPr>
+          <w:rFonts w:ascii="Times New Roman" w:hAnsi="Times New Roman"/>
+        </w:rPr>
+        <w:t xml:space="preserve">calibración por eco de la Sec. 6 quita casi la mitad del error restante.</w:t>
       </w:r>
     </w:p>
-    <w:bookmarkStart w:id="34" w:name="qué-es-nuevo-y-qué-no."/>
+    <w:bookmarkStart w:id="36" w:name="qué-es-nuevo-y-qué-no."/>
     <w:p>
       <w:pPr>
         <w:pStyle w:val="Heading4"/>
@@ -9908,8 +11336,8 @@
         <w:t xml:space="preserve">predicción registrada antes de su corrida, y el ángulo en radianes que el radio libera del ruido.</w:t>
       </w:r>
     </w:p>
-    <w:bookmarkEnd w:id="34"/>
-    <w:bookmarkStart w:id="35" w:name="limitaciones."/>
+    <w:bookmarkEnd w:id="36"/>
+    <w:bookmarkStart w:id="37" w:name="limitaciones."/>
     <w:p>
       <w:pPr>
         <w:pStyle w:val="Heading4"/>
@@ -9956,9 +11384,9 @@
         <w:t xml:space="preserve">ventaja cuántica.</w:t>
       </w:r>
     </w:p>
-    <w:bookmarkEnd w:id="35"/>
-    <w:bookmarkEnd w:id="36"/>
-    <w:bookmarkStart w:id="38" w:name="disponibilidad-de-código-y-datos"/>
+    <w:bookmarkEnd w:id="37"/>
+    <w:bookmarkEnd w:id="38"/>
+    <w:bookmarkStart w:id="40" w:name="disponibilidad-de-código-y-datos"/>
     <w:p>
       <w:pPr>
         <w:pStyle w:val="Heading1"/>
@@ -10003,7 +11431,7 @@
         <w:rPr>
           <w:rFonts w:ascii="Times New Roman" w:hAnsi="Times New Roman"/>
         </w:rPr>
-        <w:t xml:space="preserve">0.6.9 (MIT,</w:t>
+        <w:t xml:space="preserve">0.6.11 (MIT,</w:t>
       </w:r>
       <w:r>
         <w:rPr>
@@ -10206,6 +11634,63 @@
           <w:rStyle w:val="VerbatimChar"/>
           <w:rFonts w:ascii="Times New Roman" w:hAnsi="Times New Roman"/>
         </w:rPr>
+        <w:t xml:space="preserve">qang.sectors</w:t>
+      </w:r>
+      <w:r>
+        <w:rPr>
+          <w:rFonts w:ascii="Times New Roman" w:hAnsi="Times New Roman"/>
+        </w:rPr>
+        <w:t xml:space="preserve"> </w:t>
+      </w:r>
+      <w:r>
+        <w:rPr>
+          <w:rFonts w:ascii="Times New Roman" w:hAnsi="Times New Roman"/>
+        </w:rPr>
+        <w:t xml:space="preserve">(</w:t>
+      </w:r>
+      <w:r>
+        <w:rPr>
+          <w:rStyle w:val="VerbatimChar"/>
+          <w:rFonts w:ascii="Times New Roman" w:hAnsi="Times New Roman"/>
+        </w:rPr>
+        <w:t xml:space="preserve">echo_transfer_matrix</w:t>
+      </w:r>
+      <w:r>
+        <w:rPr>
+          <w:rFonts w:ascii="Times New Roman" w:hAnsi="Times New Roman"/>
+        </w:rPr>
+        <w:t xml:space="preserve">,</w:t>
+      </w:r>
+      <w:r>
+        <w:rPr>
+          <w:rFonts w:ascii="Times New Roman" w:hAnsi="Times New Roman"/>
+        </w:rPr>
+        <w:t xml:space="preserve"> </w:t>
+      </w:r>
+      <w:r>
+        <w:rPr>
+          <w:rStyle w:val="VerbatimChar"/>
+          <w:rFonts w:ascii="Times New Roman" w:hAnsi="Times New Roman"/>
+        </w:rPr>
+        <w:t xml:space="preserve">unmix_sector</w:t>
+      </w:r>
+      <w:r>
+        <w:rPr>
+          <w:rFonts w:ascii="Times New Roman" w:hAnsi="Times New Roman"/>
+        </w:rPr>
+        <w:t xml:space="preserve">),</w:t>
+      </w:r>
+      <w:r>
+        <w:rPr>
+          <w:rFonts w:ascii="Times New Roman" w:hAnsi="Times New Roman"/>
+        </w:rPr>
+        <w:t xml:space="preserve"> </w:t>
+      </w:r>
+      <w:r>
+        <w:rPr>
+          <w:rStyle w:val="VerbatimChar"/>
+          <w:rFonts w:ascii="Times New Roman" w:hAnsi="Times New Roman"/>
+        </w:rPr>
         <w:t xml:space="preserve">qang.statistics</w:t>
       </w:r>
       <w:r>
@@ -10415,7 +11900,7 @@
         </w:rPr>
         <w:t xml:space="preserve"> </w:t>
       </w:r>
-      <w:hyperlink r:id="rId37">
+      <w:hyperlink r:id="rId39">
         <w:r>
           <w:rPr>
             <w:rStyle w:val="Hyperlink"/>
@@ -10430,8 +11915,8 @@
         <w:t xml:space="preserve">.</w:t>
       </w:r>
     </w:p>
-    <w:bookmarkEnd w:id="38"/>
-    <w:bookmarkStart w:id="55" w:name="uso-de-herramientas-de-ia"/>
+    <w:bookmarkEnd w:id="40"/>
+    <w:bookmarkStart w:id="57" w:name="uso-de-herramientas-de-ia"/>
     <w:p>
       <w:pPr>
         <w:pStyle w:val="Heading1"/>
@@ -10466,8 +11951,8 @@
         <w:t xml:space="preserve">redacción. El autor propuso la métrica de superficie, planteó las preguntas y revisó y validó todo el material.</w:t>
       </w:r>
     </w:p>
-    <w:bookmarkStart w:id="54" w:name="refs"/>
-    <w:bookmarkStart w:id="39" w:name="ref-bonetmonroig2018"/>
+    <w:bookmarkStart w:id="56" w:name="refs"/>
+    <w:bookmarkStart w:id="41" w:name="ref-bonetmonroig2018"/>
     <w:p>
       <w:pPr>
         <w:pStyle w:val="Bibliography"/>
@@ -10517,8 +12002,8 @@
         <w:t xml:space="preserve">98: 062339.</w:t>
       </w:r>
     </w:p>
-    <w:bookmarkEnd w:id="39"/>
-    <w:bookmarkStart w:id="40" w:name="ref-brennen2003"/>
+    <w:bookmarkEnd w:id="41"/>
+    <w:bookmarkStart w:id="42" w:name="ref-brennen2003"/>
     <w:p>
       <w:pPr>
         <w:pStyle w:val="Bibliography"/>
@@ -10568,8 +12053,8 @@
         <w:t xml:space="preserve">3: 619–26.</w:t>
       </w:r>
     </w:p>
-    <w:bookmarkEnd w:id="40"/>
-    <w:bookmarkStart w:id="42" w:name="ref-coffman2000"/>
+    <w:bookmarkEnd w:id="42"/>
+    <w:bookmarkStart w:id="44" w:name="ref-coffman2000"/>
     <w:p>
       <w:pPr>
         <w:pStyle w:val="Bibliography"/>
@@ -10624,7 +12109,7 @@
         </w:rPr>
         <w:t xml:space="preserve"> </w:t>
       </w:r>
-      <w:hyperlink r:id="rId41">
+      <w:hyperlink r:id="rId43">
         <w:r>
           <w:rPr>
             <w:rStyle w:val="Hyperlink"/>
@@ -10639,8 +12124,8 @@
         <w:t xml:space="preserve">.</w:t>
       </w:r>
     </w:p>
-    <w:bookmarkEnd w:id="42"/>
-    <w:bookmarkStart w:id="43" w:name="ref-mcardle2019"/>
+    <w:bookmarkEnd w:id="44"/>
+    <w:bookmarkStart w:id="45" w:name="ref-mcardle2019"/>
     <w:p>
       <w:pPr>
         <w:pStyle w:val="Bibliography"/>
@@ -10690,8 +12175,8 @@
         <w:t xml:space="preserve">122: 180501.</w:t>
       </w:r>
     </w:p>
-    <w:bookmarkEnd w:id="43"/>
-    <w:bookmarkStart w:id="45" w:name="ref-meyer2002"/>
+    <w:bookmarkEnd w:id="45"/>
+    <w:bookmarkStart w:id="47" w:name="ref-meyer2002"/>
     <w:p>
       <w:pPr>
         <w:pStyle w:val="Bibliography"/>
@@ -10746,7 +12231,7 @@
         </w:rPr>
         <w:t xml:space="preserve"> </w:t>
       </w:r>
-      <w:hyperlink r:id="rId44">
+      <w:hyperlink r:id="rId46">
         <w:r>
           <w:rPr>
             <w:rStyle w:val="Hyperlink"/>
@@ -10761,8 +12246,8 @@
         <w:t xml:space="preserve">.</w:t>
       </w:r>
     </w:p>
-    <w:bookmarkEnd w:id="45"/>
-    <w:bookmarkStart w:id="46" w:name="ref-monteverde2026formulation"/>
+    <w:bookmarkEnd w:id="47"/>
+    <w:bookmarkStart w:id="48" w:name="ref-monteverde2026formulation"/>
     <w:p>
       <w:pPr>
         <w:pStyle w:val="Bibliography"/>
@@ -10786,8 +12271,8 @@
         <w:t xml:space="preserve">“Quantum Gates and Algorithms in Qg Units: Hamming-Weight Conservation, Readout Classes and the Local Radius.”</w:t>
       </w:r>
     </w:p>
-    <w:bookmarkEnd w:id="46"/>
-    <w:bookmarkStart w:id="48" w:name="ref-monteverde2026qang"/>
+    <w:bookmarkEnd w:id="48"/>
+    <w:bookmarkStart w:id="50" w:name="ref-monteverde2026qang"/>
     <w:p>
       <w:pPr>
         <w:pStyle w:val="Bibliography"/>
@@ -10840,7 +12325,7 @@
         </w:rPr>
         <w:t xml:space="preserve"> </w:t>
       </w:r>
-      <w:hyperlink r:id="rId47">
+      <w:hyperlink r:id="rId49">
         <w:r>
           <w:rPr>
             <w:rStyle w:val="Hyperlink"/>
@@ -10855,8 +12340,8 @@
         <w:t xml:space="preserve">.</w:t>
       </w:r>
     </w:p>
-    <w:bookmarkEnd w:id="48"/>
-    <w:bookmarkStart w:id="50" w:name="ref-monteverde2026witness"/>
+    <w:bookmarkEnd w:id="50"/>
+    <w:bookmarkStart w:id="52" w:name="ref-monteverde2026witness"/>
     <w:p>
       <w:pPr>
         <w:pStyle w:val="Bibliography"/>
@@ -10905,7 +12390,7 @@
         </w:rPr>
         <w:t xml:space="preserve"> </w:t>
       </w:r>
-      <w:hyperlink r:id="rId49">
+      <w:hyperlink r:id="rId51">
         <w:r>
           <w:rPr>
             <w:rStyle w:val="Hyperlink"/>
@@ -10920,8 +12405,8 @@
         <w:t xml:space="preserve">.</w:t>
       </w:r>
     </w:p>
-    <w:bookmarkEnd w:id="50"/>
-    <w:bookmarkStart w:id="51" w:name="ref-monteverde2026qml"/>
+    <w:bookmarkEnd w:id="52"/>
+    <w:bookmarkStart w:id="53" w:name="ref-monteverde2026qml"/>
     <w:p>
       <w:pPr>
         <w:pStyle w:val="Bibliography"/>
@@ -10963,8 +12448,8 @@
         <w:t xml:space="preserve">-Limited Hardware: What the Qg Symmetry Filter Does and Does Not Do.”</w:t>
       </w:r>
     </w:p>
-    <w:bookmarkEnd w:id="51"/>
-    <w:bookmarkStart w:id="53" w:name="ref-wootters1998"/>
+    <w:bookmarkEnd w:id="53"/>
+    <w:bookmarkStart w:id="55" w:name="ref-wootters1998"/>
     <w:p>
       <w:pPr>
         <w:pStyle w:val="Bibliography"/>
@@ -11019,7 +12504,7 @@
         </w:rPr>
         <w:t xml:space="preserve"> </w:t>
       </w:r>
-      <w:hyperlink r:id="rId52">
+      <w:hyperlink r:id="rId54">
         <w:r>
           <w:rPr>
             <w:rStyle w:val="Hyperlink"/>
@@ -11034,9 +12519,9 @@
         <w:t xml:space="preserve">.</w:t>
       </w:r>
     </w:p>
-    <w:bookmarkEnd w:id="53"/>
-    <w:bookmarkEnd w:id="54"/>
     <w:bookmarkEnd w:id="55"/>
+    <w:bookmarkEnd w:id="56"/>
+    <w:bookmarkEnd w:id="57"/>
     <w:sectPr/>
   </w:body>
 </w:document>

</xml_diff>